<commit_message>
update Phieu bao cao ca nhom
</commit_message>
<xml_diff>
--- a/Báo cáo.docx
+++ b/Báo cáo.docx
@@ -17786,17 +17786,7 @@
           <w:sz w:val="26"/>
           <w:szCs w:val="26"/>
         </w:rPr>
-        <w:t>Trong kỷ nguyên số hóa và sự bùng nổ của cuộc Cách mạng Công nghiệp lần thứ tư, hệ thống công nghệ thông tin đã trở thành hạ tầng cốt lõi cho mọi hoạt động kinh tế, xã hội và quản lý hành chính. Sự chuyển dịch của các dòng dữ liệu lên không gian mạng mang lại hiệu quả vận hành vượt trội, nhưng đồng thời cũng đối mặt với những thách thức lớn về an toàn thông tin. Các nguy cơ tấn công mạng ngày càng gia tăng với phương thức tinh vi, từ việc ngăn chặn, chỉnh sửa trái phép đến giả mạo dữ liệu trong quá trình truyền tải [3]. Trong bối cảnh đó, việc đảm bảo tính toàn vẹn (Integrity) và tính xác thực (Authenticity) của thông tin trở thành điều ki</w:t>
-      </w:r>
-      <w:bookmarkStart w:id="3" w:name="_GoBack"/>
-      <w:bookmarkEnd w:id="3"/>
-      <w:r>
-        <w:rPr>
-          <w:color w:val="000000"/>
-          <w:sz w:val="26"/>
-          <w:szCs w:val="26"/>
-        </w:rPr>
-        <w:t>ện tiên quyết để xây dựng niềm tin số và bảo vệ tài sản thông tin của tổ chức, cá nhân.</w:t>
+        <w:t>Trong kỷ nguyên số hóa và sự bùng nổ của cuộc Cách mạng Công nghiệp lần thứ tư, hệ thống công nghệ thông tin đã trở thành hạ tầng cốt lõi cho mọi hoạt động kinh tế, xã hội và quản lý hành chính. Sự chuyển dịch của các dòng dữ liệu lên không gian mạng mang lại hiệu quả vận hành vượt trội, nhưng đồng thời cũng đối mặt với những thách thức lớn về an toàn thông tin. Các nguy cơ tấn công mạng ngày càng gia tăng với phương thức tinh vi, từ việc ngăn chặn, chỉnh sửa trái phép đến giả mạo dữ liệu trong quá trình truyền tải [3]. Trong bối cảnh đó, việc đảm bảo tính toàn vẹn (Integrity) và tính xác thực (Authenticity) của thông tin trở thành điều kiện tiên quyết để xây dựng niềm tin số và bảo vệ tài sản thông tin của tổ chức, cá nhân.</w:t>
       </w:r>
     </w:p>
     <w:p>
@@ -17873,12 +17863,12 @@
         <w:spacing w:before="0" w:after="0" w:line="312" w:lineRule="auto"/>
         <w:jc w:val="both"/>
       </w:pPr>
-      <w:bookmarkStart w:id="4" w:name="_Toc230774882"/>
+      <w:bookmarkStart w:id="3" w:name="_Toc230774882"/>
       <w:r>
         <w:lastRenderedPageBreak/>
         <w:t>CHƯƠNG 1: TỔNG QUAN</w:t>
       </w:r>
-      <w:bookmarkEnd w:id="4"/>
+      <w:bookmarkEnd w:id="3"/>
     </w:p>
     <w:p>
       <w:pPr>
@@ -17886,7 +17876,7 @@
         <w:spacing w:before="0" w:after="0" w:line="312" w:lineRule="auto"/>
         <w:jc w:val="both"/>
       </w:pPr>
-      <w:bookmarkStart w:id="5" w:name="_Toc230774883"/>
+      <w:bookmarkStart w:id="4" w:name="_Toc230774883"/>
       <w:r>
         <w:t xml:space="preserve">1.1. Tổng quan về </w:t>
       </w:r>
@@ -17898,7 +17888,7 @@
       <w:r>
         <w:t xml:space="preserve"> ninh mạng</w:t>
       </w:r>
-      <w:bookmarkEnd w:id="5"/>
+      <w:bookmarkEnd w:id="4"/>
       <w:r>
         <w:t> </w:t>
       </w:r>
@@ -17909,11 +17899,11 @@
         <w:spacing w:before="0" w:after="0" w:line="312" w:lineRule="auto"/>
         <w:jc w:val="both"/>
       </w:pPr>
-      <w:bookmarkStart w:id="6" w:name="_Toc230774884"/>
+      <w:bookmarkStart w:id="5" w:name="_Toc230774884"/>
       <w:r>
         <w:t>1.1.1 An ninh mạng</w:t>
       </w:r>
-      <w:bookmarkEnd w:id="6"/>
+      <w:bookmarkEnd w:id="5"/>
     </w:p>
     <w:p>
       <w:pPr>
@@ -18055,11 +18045,11 @@
         <w:spacing w:before="0" w:after="0" w:line="312" w:lineRule="auto"/>
         <w:jc w:val="both"/>
       </w:pPr>
-      <w:bookmarkStart w:id="7" w:name="_Toc230774885"/>
+      <w:bookmarkStart w:id="6" w:name="_Toc230774885"/>
       <w:r>
         <w:t>1.1.2. Các mối đe dọa và hình thức tấn công</w:t>
       </w:r>
-      <w:bookmarkEnd w:id="7"/>
+      <w:bookmarkEnd w:id="6"/>
     </w:p>
     <w:p>
       <w:pPr>
@@ -18302,11 +18292,11 @@
         <w:spacing w:before="0" w:after="0" w:line="312" w:lineRule="auto"/>
         <w:jc w:val="both"/>
       </w:pPr>
-      <w:bookmarkStart w:id="8" w:name="_Toc230774886"/>
+      <w:bookmarkStart w:id="7" w:name="_Toc230774886"/>
       <w:r>
         <w:t>1.1.3. Các biện pháp kiểm soát an ninh mạng</w:t>
       </w:r>
-      <w:bookmarkEnd w:id="8"/>
+      <w:bookmarkEnd w:id="7"/>
     </w:p>
     <w:p>
       <w:pPr>
@@ -18436,11 +18426,11 @@
         <w:spacing w:before="0" w:after="0" w:line="312" w:lineRule="auto"/>
         <w:jc w:val="both"/>
       </w:pPr>
-      <w:bookmarkStart w:id="9" w:name="_Toc230774887"/>
+      <w:bookmarkStart w:id="8" w:name="_Toc230774887"/>
       <w:r>
         <w:t>1.2. Các kiến thức cơ sở</w:t>
       </w:r>
-      <w:bookmarkEnd w:id="9"/>
+      <w:bookmarkEnd w:id="8"/>
     </w:p>
     <w:p>
       <w:pPr>
@@ -18488,7 +18478,7 @@
           <w:szCs w:val="26"/>
         </w:rPr>
       </w:pPr>
-      <w:bookmarkStart w:id="10" w:name="_Toc230774888"/>
+      <w:bookmarkStart w:id="9" w:name="_Toc230774888"/>
       <w:r>
         <w:rPr>
           <w:rFonts w:eastAsia="Times New Roman" w:cs="Times New Roman"/>
@@ -18496,7 +18486,7 @@
         </w:rPr>
         <w:t>1.2.1. Kiến thức toán học</w:t>
       </w:r>
-      <w:bookmarkEnd w:id="10"/>
+      <w:bookmarkEnd w:id="9"/>
     </w:p>
     <w:p>
       <w:pPr>
@@ -19718,7 +19708,7 @@
           <w:szCs w:val="26"/>
         </w:rPr>
       </w:pPr>
-      <w:bookmarkStart w:id="11" w:name="_Toc230774889"/>
+      <w:bookmarkStart w:id="10" w:name="_Toc230774889"/>
       <w:r>
         <w:rPr>
           <w:rFonts w:eastAsia="Times New Roman" w:cs="Times New Roman"/>
@@ -19726,7 +19716,7 @@
         </w:rPr>
         <w:t>1.2.2. Hàm băm trong mật mã học</w:t>
       </w:r>
-      <w:bookmarkEnd w:id="11"/>
+      <w:bookmarkEnd w:id="10"/>
     </w:p>
     <w:p>
       <w:pPr>
@@ -20151,7 +20141,7 @@
           <w:szCs w:val="26"/>
         </w:rPr>
       </w:pPr>
-      <w:bookmarkStart w:id="12" w:name="_Toc230774890"/>
+      <w:bookmarkStart w:id="11" w:name="_Toc230774890"/>
       <w:r>
         <w:rPr>
           <w:rFonts w:eastAsia="Times New Roman" w:cs="Times New Roman"/>
@@ -20160,7 +20150,7 @@
         <w:lastRenderedPageBreak/>
         <w:t>1.2.3. Thuật toán liên quan</w:t>
       </w:r>
-      <w:bookmarkEnd w:id="12"/>
+      <w:bookmarkEnd w:id="11"/>
     </w:p>
     <w:p>
       <w:pPr>
@@ -20467,7 +20457,7 @@
           <w:szCs w:val="26"/>
         </w:rPr>
       </w:pPr>
-      <w:bookmarkStart w:id="13" w:name="_Toc230774891"/>
+      <w:bookmarkStart w:id="12" w:name="_Toc230774891"/>
       <w:r>
         <w:rPr>
           <w:rFonts w:cs="Times New Roman"/>
@@ -20475,7 +20465,7 @@
         </w:rPr>
         <w:t>1.2.4. Ngôn ngữ lập trình và thư viện hỗ trợ</w:t>
       </w:r>
-      <w:bookmarkEnd w:id="13"/>
+      <w:bookmarkEnd w:id="12"/>
     </w:p>
     <w:p>
       <w:pPr>
@@ -21189,7 +21179,7 @@
           <w:szCs w:val="26"/>
         </w:rPr>
       </w:pPr>
-      <w:bookmarkStart w:id="14" w:name="_Toc230774892"/>
+      <w:bookmarkStart w:id="13" w:name="_Toc230774892"/>
       <w:r>
         <w:rPr>
           <w:rFonts w:eastAsia="Times New Roman" w:cs="Times New Roman"/>
@@ -21197,7 +21187,7 @@
         </w:rPr>
         <w:t>1.2.5. So sánh Java và C# trong triển khai mật mã</w:t>
       </w:r>
-      <w:bookmarkEnd w:id="14"/>
+      <w:bookmarkEnd w:id="13"/>
     </w:p>
     <w:tbl>
       <w:tblPr>
@@ -21764,7 +21754,7 @@
           <w:szCs w:val="26"/>
         </w:rPr>
       </w:pPr>
-      <w:bookmarkStart w:id="15" w:name="_Toc230774893"/>
+      <w:bookmarkStart w:id="14" w:name="_Toc230774893"/>
       <w:r>
         <w:rPr>
           <w:rFonts w:cs="Times New Roman"/>
@@ -21772,7 +21762,7 @@
         </w:rPr>
         <w:t>1.2.6. Lưu ý khi lập trình mật mã</w:t>
       </w:r>
-      <w:bookmarkEnd w:id="15"/>
+      <w:bookmarkEnd w:id="14"/>
     </w:p>
     <w:p>
       <w:pPr>
@@ -21916,7 +21906,7 @@
           <w:szCs w:val="26"/>
         </w:rPr>
       </w:pPr>
-      <w:bookmarkStart w:id="16" w:name="_Toc230774894"/>
+      <w:bookmarkStart w:id="15" w:name="_Toc230774894"/>
       <w:r>
         <w:rPr>
           <w:rFonts w:eastAsia="Times New Roman" w:cs="Times New Roman"/>
@@ -21924,7 +21914,7 @@
         </w:rPr>
         <w:t>1.2.7. Kết luận</w:t>
       </w:r>
-      <w:bookmarkEnd w:id="16"/>
+      <w:bookmarkEnd w:id="15"/>
     </w:p>
     <w:p>
       <w:pPr>
@@ -21999,11 +21989,11 @@
         <w:spacing w:before="0" w:after="0" w:line="312" w:lineRule="auto"/>
         <w:jc w:val="both"/>
       </w:pPr>
-      <w:bookmarkStart w:id="17" w:name="_Toc230774895"/>
+      <w:bookmarkStart w:id="16" w:name="_Toc230774895"/>
       <w:r>
         <w:t>1.3. Nội dung nghiên cứu</w:t>
       </w:r>
-      <w:bookmarkEnd w:id="17"/>
+      <w:bookmarkEnd w:id="16"/>
       <w:r>
         <w:t xml:space="preserve"> </w:t>
       </w:r>
@@ -22144,12 +22134,12 @@
         <w:spacing w:before="0" w:after="0" w:line="312" w:lineRule="auto"/>
         <w:jc w:val="both"/>
       </w:pPr>
-      <w:bookmarkStart w:id="18" w:name="_Toc230774896"/>
+      <w:bookmarkStart w:id="17" w:name="_Toc230774896"/>
       <w:r>
         <w:lastRenderedPageBreak/>
         <w:t>1.3.2. Nội dung nghiên cứu</w:t>
       </w:r>
-      <w:bookmarkEnd w:id="18"/>
+      <w:bookmarkEnd w:id="17"/>
     </w:p>
     <w:p>
       <w:pPr>
@@ -22267,12 +22257,12 @@
         <w:spacing w:before="0" w:after="0" w:line="312" w:lineRule="auto"/>
         <w:jc w:val="both"/>
       </w:pPr>
-      <w:bookmarkStart w:id="19" w:name="_Toc230774897"/>
+      <w:bookmarkStart w:id="18" w:name="_Toc230774897"/>
       <w:r>
         <w:lastRenderedPageBreak/>
         <w:t>Chương 2: Kết quả nghiên cứu</w:t>
       </w:r>
-      <w:bookmarkEnd w:id="19"/>
+      <w:bookmarkEnd w:id="18"/>
     </w:p>
     <w:p>
       <w:pPr>
@@ -22280,11 +22270,11 @@
         <w:spacing w:before="0" w:after="0" w:line="312" w:lineRule="auto"/>
         <w:jc w:val="both"/>
       </w:pPr>
-      <w:bookmarkStart w:id="20" w:name="_Toc230774898"/>
+      <w:bookmarkStart w:id="19" w:name="_Toc230774898"/>
       <w:r>
         <w:t>2.1. Nghiên cứu, tìm hiểu hệ mã hóa khóa công khai.</w:t>
       </w:r>
-      <w:bookmarkEnd w:id="20"/>
+      <w:bookmarkEnd w:id="19"/>
     </w:p>
     <w:p>
       <w:pPr>
@@ -22292,11 +22282,11 @@
         <w:spacing w:before="0" w:after="0" w:line="312" w:lineRule="auto"/>
         <w:jc w:val="both"/>
       </w:pPr>
-      <w:bookmarkStart w:id="21" w:name="_Toc230774899"/>
+      <w:bookmarkStart w:id="20" w:name="_Toc230774899"/>
       <w:r>
         <w:t>2.1.1. Khái niệm và nguyên lý hoạt động của mã hóa khóa công khai.</w:t>
       </w:r>
-      <w:bookmarkEnd w:id="21"/>
+      <w:bookmarkEnd w:id="20"/>
     </w:p>
     <w:p>
       <w:pPr>
@@ -23334,7 +23324,7 @@
           <w:szCs w:val="26"/>
         </w:rPr>
       </w:pPr>
-      <w:bookmarkStart w:id="22" w:name="_Toc230774900"/>
+      <w:bookmarkStart w:id="21" w:name="_Toc230774900"/>
       <w:r>
         <w:rPr>
           <w:rFonts w:cs="Times New Roman"/>
@@ -23342,7 +23332,7 @@
         </w:rPr>
         <w:t>2.1.2. Các phương pháp mã hóa phổ biến hiện nay</w:t>
       </w:r>
-      <w:bookmarkEnd w:id="22"/>
+      <w:bookmarkEnd w:id="21"/>
     </w:p>
     <w:p>
       <w:pPr>
@@ -23432,6 +23422,8 @@
         </w:rPr>
         <w:t>Cơ chế hoạt động: Dữ liệu rõ (Plaintext) kết hợp với Khóa đối xứng qua thuật toán mã hóa để tạo ra bản mã (Ciphertext). Người nhận sử dụng chính khóa đó để đảo ngược thuật toán, đưa bản mã về dữ liệu rõ ban đầu.</w:t>
       </w:r>
+      <w:bookmarkStart w:id="22" w:name="_GoBack"/>
+      <w:bookmarkEnd w:id="22"/>
     </w:p>
     <w:p>
       <w:pPr>
@@ -24197,22 +24189,9 @@
     <w:p>
       <w:pPr>
         <w:pStyle w:val="Heading2"/>
-        <w:spacing w:before="0" w:after="0" w:line="312" w:lineRule="auto"/>
-        <w:ind w:left="700"/>
-        <w:jc w:val="both"/>
-        <w:rPr>
-          <w:rFonts w:cs="Times New Roman"/>
-        </w:rPr>
       </w:pPr>
       <w:bookmarkStart w:id="24" w:name="_Toc230774902"/>
       <w:r>
-        <w:rPr>
-          <w:rFonts w:cs="Times New Roman"/>
-          <w:b w:val="0"/>
-          <w:bCs/>
-          <w:color w:val="000000"/>
-          <w:sz w:val="26"/>
-        </w:rPr>
         <w:lastRenderedPageBreak/>
         <w:t>2.2. Nghiên cứu, tìm hiểu về Chữ ký số Elgamal</w:t>
       </w:r>
@@ -24226,7 +24205,13 @@
       </w:pPr>
       <w:bookmarkStart w:id="25" w:name="_Toc230774903"/>
       <w:r>
-        <w:t>2.2.1. Cấu trúc và nguyên lý hoạt động của thuật toán Elmagal.</w:t>
+        <w:t>2.2.1. Cấu trúc và nguyên lý hoạt động của thuậ</w:t>
+      </w:r>
+      <w:r>
+        <w:t>t toán Elgamal</w:t>
+      </w:r>
+      <w:r>
+        <w:t>.</w:t>
       </w:r>
       <w:bookmarkEnd w:id="25"/>
     </w:p>
@@ -28433,7 +28418,7 @@
 </file>
 
 <file path=customXml/itemProps1.xml><?xml version="1.0" encoding="utf-8"?>
-<ds:datastoreItem xmlns:ds="http://schemas.openxmlformats.org/officeDocument/2006/customXml" ds:itemID="{DF96C37B-13BF-42D2-BFBF-BDCDE05AAE0C}">
+<ds:datastoreItem xmlns:ds="http://schemas.openxmlformats.org/officeDocument/2006/customXml" ds:itemID="{271C81A9-1350-43E6-898A-61706E06EBCB}">
   <ds:schemaRefs>
     <ds:schemaRef ds:uri="http://schemas.openxmlformats.org/officeDocument/2006/bibliography"/>
   </ds:schemaRefs>

</xml_diff>

<commit_message>
push noi dung hoan chinh
</commit_message>
<xml_diff>
--- a/Báo cáo.docx
+++ b/Báo cáo.docx
@@ -14586,7 +14586,27 @@
           <w:szCs w:val="36"/>
           <w:lang w:val="en-US"/>
         </w:rPr>
-        <w:t>Chữ ký số Elgmal và ứng dụng trong xác thực tính toàn vẹn của dữ liệu</w:t>
+        <w:t>Chữ ký số Elg</w:t>
+      </w:r>
+      <w:r>
+        <w:rPr>
+          <w:b/>
+          <w:bCs/>
+          <w:sz w:val="36"/>
+          <w:szCs w:val="36"/>
+          <w:lang w:val="en-US"/>
+        </w:rPr>
+        <w:t>a</w:t>
+      </w:r>
+      <w:r>
+        <w:rPr>
+          <w:b/>
+          <w:bCs/>
+          <w:sz w:val="36"/>
+          <w:szCs w:val="36"/>
+          <w:lang w:val="en-US"/>
+        </w:rPr>
+        <w:t>mal và ứng dụng trong xác thực tính toàn vẹn của dữ liệu</w:t>
       </w:r>
     </w:p>
     <w:p>
@@ -15114,8 +15134,6 @@
         </w:rPr>
       </w:sdtEndPr>
       <w:sdtContent>
-        <w:bookmarkStart w:id="0" w:name="_GoBack" w:displacedByCustomXml="prev"/>
-        <w:bookmarkEnd w:id="0" w:displacedByCustomXml="prev"/>
         <w:p>
           <w:pPr>
             <w:pStyle w:val="TOCHeading"/>
@@ -18042,12 +18060,12 @@
         <w:spacing w:before="0" w:after="0" w:line="312" w:lineRule="auto"/>
         <w:jc w:val="both"/>
       </w:pPr>
-      <w:bookmarkStart w:id="1" w:name="_Toc231896326"/>
+      <w:bookmarkStart w:id="0" w:name="_Toc231896326"/>
       <w:r>
         <w:lastRenderedPageBreak/>
         <w:t>DANH MỤC HÌNH ẢNH</w:t>
       </w:r>
-      <w:bookmarkEnd w:id="1"/>
+      <w:bookmarkEnd w:id="0"/>
     </w:p>
     <w:p>
       <w:pPr>
@@ -19551,11 +19569,2494 @@
     </w:p>
     <w:p>
       <w:pPr>
+        <w:pStyle w:val="Heading1"/>
+        <w:numPr>
+          <w:ilvl w:val="0"/>
+          <w:numId w:val="0"/>
+        </w:numPr>
+        <w:spacing w:before="0" w:after="0" w:line="312" w:lineRule="auto"/>
+      </w:pPr>
+      <w:r>
+        <w:fldChar w:fldCharType="end"/>
+      </w:r>
+      <w:r>
+        <w:t>DANH MỤC BẢNG BIỂU</w:t>
+      </w:r>
+    </w:p>
+    <w:p>
+      <w:pPr>
+        <w:pStyle w:val="TableofFigures"/>
+        <w:tabs>
+          <w:tab w:val="right" w:leader="dot" w:pos="9111"/>
+        </w:tabs>
+        <w:spacing w:line="312" w:lineRule="auto"/>
+        <w:rPr>
+          <w:rFonts w:asciiTheme="minorHAnsi" w:eastAsiaTheme="minorEastAsia" w:hAnsiTheme="minorHAnsi"/>
+          <w:noProof/>
+          <w:sz w:val="22"/>
+          <w:lang w:val="en-US"/>
+        </w:rPr>
+      </w:pPr>
+      <w:r>
+        <w:rPr>
+          <w:b/>
+          <w:bCs/>
+          <w:color w:val="000000"/>
+          <w:szCs w:val="26"/>
+        </w:rPr>
+        <w:fldChar w:fldCharType="begin"/>
+      </w:r>
+      <w:r>
+        <w:rPr>
+          <w:b/>
+          <w:bCs/>
+          <w:color w:val="000000"/>
+          <w:szCs w:val="26"/>
+        </w:rPr>
+        <w:instrText xml:space="preserve"> TOC \h \z \c "Bảng" </w:instrText>
+      </w:r>
+      <w:r>
+        <w:rPr>
+          <w:b/>
+          <w:bCs/>
+          <w:color w:val="000000"/>
+          <w:szCs w:val="26"/>
+        </w:rPr>
+        <w:fldChar w:fldCharType="separate"/>
+      </w:r>
+      <w:hyperlink w:anchor="_Toc232051838" w:history="1">
+        <w:r>
+          <w:rPr>
+            <w:rStyle w:val="Hyperlink"/>
+            <w:noProof/>
+          </w:rPr>
+          <w:t>Bảng 1.1. So sánh Java và C# trong triển khai mật mã</w:t>
+        </w:r>
+        <w:r>
+          <w:rPr>
+            <w:noProof/>
+            <w:webHidden/>
+          </w:rPr>
+          <w:tab/>
+        </w:r>
+        <w:r>
+          <w:rPr>
+            <w:noProof/>
+            <w:webHidden/>
+          </w:rPr>
+          <w:fldChar w:fldCharType="begin"/>
+        </w:r>
+        <w:r>
+          <w:rPr>
+            <w:noProof/>
+            <w:webHidden/>
+          </w:rPr>
+          <w:instrText xml:space="preserve"> PAGEREF _Toc232051838 \h </w:instrText>
+        </w:r>
+        <w:r>
+          <w:rPr>
+            <w:noProof/>
+            <w:webHidden/>
+          </w:rPr>
+        </w:r>
+        <w:r>
+          <w:rPr>
+            <w:noProof/>
+            <w:webHidden/>
+          </w:rPr>
+          <w:fldChar w:fldCharType="separate"/>
+        </w:r>
+        <w:r>
+          <w:rPr>
+            <w:noProof/>
+            <w:webHidden/>
+          </w:rPr>
+          <w:t>13</w:t>
+        </w:r>
+        <w:r>
+          <w:rPr>
+            <w:noProof/>
+            <w:webHidden/>
+          </w:rPr>
+          <w:fldChar w:fldCharType="end"/>
+        </w:r>
+      </w:hyperlink>
+    </w:p>
+    <w:p>
+      <w:pPr>
+        <w:pStyle w:val="Heading1"/>
+        <w:numPr>
+          <w:ilvl w:val="0"/>
+          <w:numId w:val="0"/>
+        </w:numPr>
+        <w:spacing w:before="0" w:after="0" w:line="312" w:lineRule="auto"/>
+      </w:pPr>
+      <w:r>
+        <w:fldChar w:fldCharType="end"/>
+      </w:r>
+      <w:r>
+        <w:t>DANH MỤC CÁC TỪ VIẾT TẮT</w:t>
+      </w:r>
+    </w:p>
+    <w:tbl>
+      <w:tblPr>
+        <w:tblStyle w:val="TableGrid"/>
+        <w:tblW w:w="0" w:type="auto"/>
+        <w:tblLook w:val="04A0" w:firstRow="1" w:lastRow="0" w:firstColumn="1" w:lastColumn="0" w:noHBand="0" w:noVBand="1"/>
+      </w:tblPr>
+      <w:tblGrid>
+        <w:gridCol w:w="1838"/>
+        <w:gridCol w:w="3544"/>
+        <w:gridCol w:w="3729"/>
+      </w:tblGrid>
+      <w:tr>
+        <w:tc>
+          <w:tcPr>
+            <w:tcW w:w="1838" w:type="dxa"/>
+            <w:vAlign w:val="bottom"/>
+          </w:tcPr>
+          <w:p>
+            <w:pPr>
+              <w:spacing w:line="288" w:lineRule="auto"/>
+              <w:jc w:val="center"/>
+              <w:rPr>
+                <w:rFonts w:cs="Times New Roman"/>
+                <w:b/>
+                <w:bCs/>
+                <w:szCs w:val="26"/>
+                <w:lang w:val="en-US"/>
+              </w:rPr>
+            </w:pPr>
+            <w:r>
+              <w:rPr>
+                <w:rFonts w:cs="Times New Roman"/>
+                <w:b/>
+                <w:bCs/>
+                <w:szCs w:val="26"/>
+              </w:rPr>
+              <w:t>Từ viết tắt</w:t>
+            </w:r>
+          </w:p>
+        </w:tc>
+        <w:tc>
+          <w:tcPr>
+            <w:tcW w:w="3544" w:type="dxa"/>
+            <w:vAlign w:val="bottom"/>
+          </w:tcPr>
+          <w:p>
+            <w:pPr>
+              <w:spacing w:line="288" w:lineRule="auto"/>
+              <w:jc w:val="center"/>
+              <w:rPr>
+                <w:rFonts w:cs="Times New Roman"/>
+                <w:b/>
+                <w:bCs/>
+                <w:szCs w:val="26"/>
+              </w:rPr>
+            </w:pPr>
+            <w:r>
+              <w:rPr>
+                <w:rFonts w:cs="Times New Roman"/>
+                <w:b/>
+                <w:bCs/>
+                <w:szCs w:val="26"/>
+              </w:rPr>
+              <w:t>Tên đầy đủ (Tiếng Anh)</w:t>
+            </w:r>
+          </w:p>
+        </w:tc>
+        <w:tc>
+          <w:tcPr>
+            <w:tcW w:w="3729" w:type="dxa"/>
+            <w:vAlign w:val="bottom"/>
+          </w:tcPr>
+          <w:p>
+            <w:pPr>
+              <w:spacing w:line="288" w:lineRule="auto"/>
+              <w:jc w:val="center"/>
+              <w:rPr>
+                <w:rFonts w:cs="Times New Roman"/>
+                <w:b/>
+                <w:bCs/>
+                <w:szCs w:val="26"/>
+              </w:rPr>
+            </w:pPr>
+            <w:r>
+              <w:rPr>
+                <w:rFonts w:cs="Times New Roman"/>
+                <w:b/>
+                <w:bCs/>
+                <w:szCs w:val="26"/>
+              </w:rPr>
+              <w:t>Nghĩa tiếng Việt</w:t>
+            </w:r>
+          </w:p>
+        </w:tc>
+      </w:tr>
+      <w:tr>
+        <w:tc>
+          <w:tcPr>
+            <w:tcW w:w="1838" w:type="dxa"/>
+            <w:vAlign w:val="bottom"/>
+          </w:tcPr>
+          <w:p>
+            <w:pPr>
+              <w:spacing w:line="288" w:lineRule="auto"/>
+              <w:rPr>
+                <w:rFonts w:cs="Times New Roman"/>
+                <w:szCs w:val="26"/>
+              </w:rPr>
+            </w:pPr>
+            <w:r>
+              <w:rPr>
+                <w:rFonts w:cs="Times New Roman"/>
+                <w:szCs w:val="26"/>
+              </w:rPr>
+              <w:t>AES</w:t>
+            </w:r>
+          </w:p>
+        </w:tc>
+        <w:tc>
+          <w:tcPr>
+            <w:tcW w:w="3544" w:type="dxa"/>
+            <w:vAlign w:val="bottom"/>
+          </w:tcPr>
+          <w:p>
+            <w:pPr>
+              <w:spacing w:line="288" w:lineRule="auto"/>
+              <w:rPr>
+                <w:rFonts w:cs="Times New Roman"/>
+                <w:szCs w:val="26"/>
+              </w:rPr>
+            </w:pPr>
+            <w:r>
+              <w:rPr>
+                <w:rFonts w:cs="Times New Roman"/>
+                <w:szCs w:val="26"/>
+              </w:rPr>
+              <w:t>Advanced Encryption Standard</w:t>
+            </w:r>
+          </w:p>
+        </w:tc>
+        <w:tc>
+          <w:tcPr>
+            <w:tcW w:w="3729" w:type="dxa"/>
+            <w:vAlign w:val="bottom"/>
+          </w:tcPr>
+          <w:p>
+            <w:pPr>
+              <w:spacing w:line="288" w:lineRule="auto"/>
+              <w:rPr>
+                <w:rFonts w:cs="Times New Roman"/>
+                <w:szCs w:val="26"/>
+              </w:rPr>
+            </w:pPr>
+            <w:r>
+              <w:rPr>
+                <w:rFonts w:cs="Times New Roman"/>
+                <w:szCs w:val="26"/>
+              </w:rPr>
+              <w:t>Chuẩn mã hóa nâng cao</w:t>
+            </w:r>
+          </w:p>
+        </w:tc>
+      </w:tr>
+      <w:tr>
+        <w:tc>
+          <w:tcPr>
+            <w:tcW w:w="1838" w:type="dxa"/>
+            <w:vAlign w:val="bottom"/>
+          </w:tcPr>
+          <w:p>
+            <w:pPr>
+              <w:spacing w:line="288" w:lineRule="auto"/>
+              <w:rPr>
+                <w:rFonts w:cs="Times New Roman"/>
+                <w:szCs w:val="26"/>
+              </w:rPr>
+            </w:pPr>
+            <w:r>
+              <w:rPr>
+                <w:rFonts w:cs="Times New Roman"/>
+                <w:szCs w:val="26"/>
+              </w:rPr>
+              <w:t>API</w:t>
+            </w:r>
+          </w:p>
+        </w:tc>
+        <w:tc>
+          <w:tcPr>
+            <w:tcW w:w="3544" w:type="dxa"/>
+            <w:vAlign w:val="bottom"/>
+          </w:tcPr>
+          <w:p>
+            <w:pPr>
+              <w:spacing w:line="288" w:lineRule="auto"/>
+              <w:rPr>
+                <w:rFonts w:cs="Times New Roman"/>
+                <w:szCs w:val="26"/>
+              </w:rPr>
+            </w:pPr>
+            <w:r>
+              <w:rPr>
+                <w:rFonts w:cs="Times New Roman"/>
+                <w:szCs w:val="26"/>
+              </w:rPr>
+              <w:t>Application Programming Interface</w:t>
+            </w:r>
+          </w:p>
+        </w:tc>
+        <w:tc>
+          <w:tcPr>
+            <w:tcW w:w="3729" w:type="dxa"/>
+            <w:vAlign w:val="bottom"/>
+          </w:tcPr>
+          <w:p>
+            <w:pPr>
+              <w:spacing w:line="288" w:lineRule="auto"/>
+              <w:rPr>
+                <w:rFonts w:cs="Times New Roman"/>
+                <w:szCs w:val="26"/>
+              </w:rPr>
+            </w:pPr>
+            <w:r>
+              <w:rPr>
+                <w:rFonts w:cs="Times New Roman"/>
+                <w:szCs w:val="26"/>
+              </w:rPr>
+              <w:t>Giao diện lập trình ứng dụng</w:t>
+            </w:r>
+          </w:p>
+        </w:tc>
+      </w:tr>
+      <w:tr>
+        <w:tc>
+          <w:tcPr>
+            <w:tcW w:w="1838" w:type="dxa"/>
+            <w:vAlign w:val="bottom"/>
+          </w:tcPr>
+          <w:p>
+            <w:pPr>
+              <w:spacing w:line="288" w:lineRule="auto"/>
+              <w:rPr>
+                <w:rFonts w:cs="Times New Roman"/>
+                <w:szCs w:val="26"/>
+              </w:rPr>
+            </w:pPr>
+            <w:r>
+              <w:rPr>
+                <w:rFonts w:cs="Times New Roman"/>
+                <w:szCs w:val="26"/>
+              </w:rPr>
+              <w:t>CIA</w:t>
+            </w:r>
+          </w:p>
+        </w:tc>
+        <w:tc>
+          <w:tcPr>
+            <w:tcW w:w="3544" w:type="dxa"/>
+            <w:vAlign w:val="bottom"/>
+          </w:tcPr>
+          <w:p>
+            <w:pPr>
+              <w:spacing w:line="288" w:lineRule="auto"/>
+              <w:rPr>
+                <w:rFonts w:cs="Times New Roman"/>
+                <w:szCs w:val="26"/>
+              </w:rPr>
+            </w:pPr>
+            <w:r>
+              <w:rPr>
+                <w:rFonts w:cs="Times New Roman"/>
+                <w:szCs w:val="26"/>
+              </w:rPr>
+              <w:t>Confidentiality – Integrity – Availability</w:t>
+            </w:r>
+          </w:p>
+        </w:tc>
+        <w:tc>
+          <w:tcPr>
+            <w:tcW w:w="3729" w:type="dxa"/>
+            <w:vAlign w:val="bottom"/>
+          </w:tcPr>
+          <w:p>
+            <w:pPr>
+              <w:spacing w:line="288" w:lineRule="auto"/>
+              <w:rPr>
+                <w:rFonts w:cs="Times New Roman"/>
+                <w:szCs w:val="26"/>
+              </w:rPr>
+            </w:pPr>
+            <w:r>
+              <w:rPr>
+                <w:rFonts w:cs="Times New Roman"/>
+                <w:szCs w:val="26"/>
+              </w:rPr>
+              <w:t>Bộ ba thuộc tính bảo mật</w:t>
+            </w:r>
+          </w:p>
+        </w:tc>
+      </w:tr>
+      <w:tr>
+        <w:tc>
+          <w:tcPr>
+            <w:tcW w:w="1838" w:type="dxa"/>
+            <w:vAlign w:val="bottom"/>
+          </w:tcPr>
+          <w:p>
+            <w:pPr>
+              <w:spacing w:line="288" w:lineRule="auto"/>
+              <w:rPr>
+                <w:rFonts w:cs="Times New Roman"/>
+                <w:szCs w:val="26"/>
+              </w:rPr>
+            </w:pPr>
+            <w:r>
+              <w:rPr>
+                <w:rFonts w:cs="Times New Roman"/>
+                <w:szCs w:val="26"/>
+              </w:rPr>
+              <w:t>DES</w:t>
+            </w:r>
+          </w:p>
+        </w:tc>
+        <w:tc>
+          <w:tcPr>
+            <w:tcW w:w="3544" w:type="dxa"/>
+            <w:vAlign w:val="bottom"/>
+          </w:tcPr>
+          <w:p>
+            <w:pPr>
+              <w:spacing w:line="288" w:lineRule="auto"/>
+              <w:rPr>
+                <w:rFonts w:cs="Times New Roman"/>
+                <w:szCs w:val="26"/>
+              </w:rPr>
+            </w:pPr>
+            <w:r>
+              <w:rPr>
+                <w:rFonts w:cs="Times New Roman"/>
+                <w:szCs w:val="26"/>
+              </w:rPr>
+              <w:t>Data Encryption Standard</w:t>
+            </w:r>
+          </w:p>
+        </w:tc>
+        <w:tc>
+          <w:tcPr>
+            <w:tcW w:w="3729" w:type="dxa"/>
+            <w:vAlign w:val="bottom"/>
+          </w:tcPr>
+          <w:p>
+            <w:pPr>
+              <w:spacing w:line="288" w:lineRule="auto"/>
+              <w:rPr>
+                <w:rFonts w:cs="Times New Roman"/>
+                <w:szCs w:val="26"/>
+              </w:rPr>
+            </w:pPr>
+            <w:r>
+              <w:rPr>
+                <w:rFonts w:cs="Times New Roman"/>
+                <w:szCs w:val="26"/>
+              </w:rPr>
+              <w:t>Chuẩn mã hóa dữ liệu</w:t>
+            </w:r>
+          </w:p>
+        </w:tc>
+      </w:tr>
+      <w:tr>
+        <w:tc>
+          <w:tcPr>
+            <w:tcW w:w="1838" w:type="dxa"/>
+            <w:vAlign w:val="bottom"/>
+          </w:tcPr>
+          <w:p>
+            <w:pPr>
+              <w:spacing w:line="288" w:lineRule="auto"/>
+              <w:rPr>
+                <w:rFonts w:cs="Times New Roman"/>
+                <w:szCs w:val="26"/>
+              </w:rPr>
+            </w:pPr>
+            <w:r>
+              <w:rPr>
+                <w:rFonts w:cs="Times New Roman"/>
+                <w:szCs w:val="26"/>
+              </w:rPr>
+              <w:t>DDoS</w:t>
+            </w:r>
+          </w:p>
+        </w:tc>
+        <w:tc>
+          <w:tcPr>
+            <w:tcW w:w="3544" w:type="dxa"/>
+            <w:vAlign w:val="bottom"/>
+          </w:tcPr>
+          <w:p>
+            <w:pPr>
+              <w:spacing w:line="288" w:lineRule="auto"/>
+              <w:rPr>
+                <w:rFonts w:cs="Times New Roman"/>
+                <w:szCs w:val="26"/>
+              </w:rPr>
+            </w:pPr>
+            <w:r>
+              <w:rPr>
+                <w:rFonts w:cs="Times New Roman"/>
+                <w:szCs w:val="26"/>
+              </w:rPr>
+              <w:t>Distributed Denial of Service</w:t>
+            </w:r>
+          </w:p>
+        </w:tc>
+        <w:tc>
+          <w:tcPr>
+            <w:tcW w:w="3729" w:type="dxa"/>
+            <w:vAlign w:val="bottom"/>
+          </w:tcPr>
+          <w:p>
+            <w:pPr>
+              <w:spacing w:line="288" w:lineRule="auto"/>
+              <w:rPr>
+                <w:rFonts w:cs="Times New Roman"/>
+                <w:szCs w:val="26"/>
+              </w:rPr>
+            </w:pPr>
+            <w:r>
+              <w:rPr>
+                <w:rFonts w:cs="Times New Roman"/>
+                <w:szCs w:val="26"/>
+              </w:rPr>
+              <w:t>Tấn công từ chối dịch vụ phân tán</w:t>
+            </w:r>
+          </w:p>
+        </w:tc>
+      </w:tr>
+      <w:tr>
+        <w:tc>
+          <w:tcPr>
+            <w:tcW w:w="1838" w:type="dxa"/>
+            <w:vAlign w:val="bottom"/>
+          </w:tcPr>
+          <w:p>
+            <w:pPr>
+              <w:spacing w:line="288" w:lineRule="auto"/>
+              <w:rPr>
+                <w:rFonts w:cs="Times New Roman"/>
+                <w:szCs w:val="26"/>
+              </w:rPr>
+            </w:pPr>
+            <w:r>
+              <w:rPr>
+                <w:rFonts w:cs="Times New Roman"/>
+                <w:szCs w:val="26"/>
+              </w:rPr>
+              <w:t>DSA</w:t>
+            </w:r>
+          </w:p>
+        </w:tc>
+        <w:tc>
+          <w:tcPr>
+            <w:tcW w:w="3544" w:type="dxa"/>
+            <w:vAlign w:val="bottom"/>
+          </w:tcPr>
+          <w:p>
+            <w:pPr>
+              <w:spacing w:line="288" w:lineRule="auto"/>
+              <w:rPr>
+                <w:rFonts w:cs="Times New Roman"/>
+                <w:szCs w:val="26"/>
+              </w:rPr>
+            </w:pPr>
+            <w:r>
+              <w:rPr>
+                <w:rFonts w:cs="Times New Roman"/>
+                <w:szCs w:val="26"/>
+              </w:rPr>
+              <w:t>Digital Signature Algorithm</w:t>
+            </w:r>
+          </w:p>
+        </w:tc>
+        <w:tc>
+          <w:tcPr>
+            <w:tcW w:w="3729" w:type="dxa"/>
+            <w:vAlign w:val="bottom"/>
+          </w:tcPr>
+          <w:p>
+            <w:pPr>
+              <w:spacing w:line="288" w:lineRule="auto"/>
+              <w:rPr>
+                <w:rFonts w:cs="Times New Roman"/>
+                <w:szCs w:val="26"/>
+              </w:rPr>
+            </w:pPr>
+            <w:r>
+              <w:rPr>
+                <w:rFonts w:cs="Times New Roman"/>
+                <w:szCs w:val="26"/>
+              </w:rPr>
+              <w:t>Thuật toán chữ ký số</w:t>
+            </w:r>
+          </w:p>
+        </w:tc>
+      </w:tr>
+      <w:tr>
+        <w:tc>
+          <w:tcPr>
+            <w:tcW w:w="1838" w:type="dxa"/>
+            <w:vAlign w:val="bottom"/>
+          </w:tcPr>
+          <w:p>
+            <w:pPr>
+              <w:spacing w:line="288" w:lineRule="auto"/>
+              <w:rPr>
+                <w:rFonts w:cs="Times New Roman"/>
+                <w:szCs w:val="26"/>
+              </w:rPr>
+            </w:pPr>
+            <w:r>
+              <w:rPr>
+                <w:rFonts w:cs="Times New Roman"/>
+                <w:szCs w:val="26"/>
+              </w:rPr>
+              <w:t>ECC</w:t>
+            </w:r>
+          </w:p>
+        </w:tc>
+        <w:tc>
+          <w:tcPr>
+            <w:tcW w:w="3544" w:type="dxa"/>
+            <w:vAlign w:val="bottom"/>
+          </w:tcPr>
+          <w:p>
+            <w:pPr>
+              <w:spacing w:line="288" w:lineRule="auto"/>
+              <w:rPr>
+                <w:rFonts w:cs="Times New Roman"/>
+                <w:szCs w:val="26"/>
+              </w:rPr>
+            </w:pPr>
+            <w:r>
+              <w:rPr>
+                <w:rFonts w:cs="Times New Roman"/>
+                <w:szCs w:val="26"/>
+              </w:rPr>
+              <w:t>Elliptic Curve Cryptography</w:t>
+            </w:r>
+          </w:p>
+        </w:tc>
+        <w:tc>
+          <w:tcPr>
+            <w:tcW w:w="3729" w:type="dxa"/>
+            <w:vAlign w:val="bottom"/>
+          </w:tcPr>
+          <w:p>
+            <w:pPr>
+              <w:spacing w:line="288" w:lineRule="auto"/>
+              <w:rPr>
+                <w:rFonts w:cs="Times New Roman"/>
+                <w:szCs w:val="26"/>
+              </w:rPr>
+            </w:pPr>
+            <w:r>
+              <w:rPr>
+                <w:rFonts w:cs="Times New Roman"/>
+                <w:szCs w:val="26"/>
+              </w:rPr>
+              <w:t>Mật mã đường cong Elliptic</w:t>
+            </w:r>
+          </w:p>
+        </w:tc>
+      </w:tr>
+      <w:tr>
+        <w:tc>
+          <w:tcPr>
+            <w:tcW w:w="1838" w:type="dxa"/>
+            <w:vAlign w:val="bottom"/>
+          </w:tcPr>
+          <w:p>
+            <w:pPr>
+              <w:spacing w:line="288" w:lineRule="auto"/>
+              <w:rPr>
+                <w:rFonts w:cs="Times New Roman"/>
+                <w:szCs w:val="26"/>
+              </w:rPr>
+            </w:pPr>
+            <w:r>
+              <w:rPr>
+                <w:rFonts w:cs="Times New Roman"/>
+                <w:szCs w:val="26"/>
+              </w:rPr>
+              <w:lastRenderedPageBreak/>
+              <w:t>ECDSA</w:t>
+            </w:r>
+          </w:p>
+        </w:tc>
+        <w:tc>
+          <w:tcPr>
+            <w:tcW w:w="3544" w:type="dxa"/>
+            <w:vAlign w:val="bottom"/>
+          </w:tcPr>
+          <w:p>
+            <w:pPr>
+              <w:spacing w:line="288" w:lineRule="auto"/>
+              <w:rPr>
+                <w:rFonts w:cs="Times New Roman"/>
+                <w:szCs w:val="26"/>
+              </w:rPr>
+            </w:pPr>
+            <w:r>
+              <w:rPr>
+                <w:rFonts w:cs="Times New Roman"/>
+                <w:szCs w:val="26"/>
+              </w:rPr>
+              <w:t>Elliptic Curve Digital Signature Algorithm</w:t>
+            </w:r>
+          </w:p>
+        </w:tc>
+        <w:tc>
+          <w:tcPr>
+            <w:tcW w:w="3729" w:type="dxa"/>
+            <w:vAlign w:val="bottom"/>
+          </w:tcPr>
+          <w:p>
+            <w:pPr>
+              <w:spacing w:line="288" w:lineRule="auto"/>
+              <w:rPr>
+                <w:rFonts w:cs="Times New Roman"/>
+                <w:szCs w:val="26"/>
+              </w:rPr>
+            </w:pPr>
+            <w:r>
+              <w:rPr>
+                <w:rFonts w:cs="Times New Roman"/>
+                <w:szCs w:val="26"/>
+              </w:rPr>
+              <w:t>Thuật toán chữ ký s</w:t>
+            </w:r>
+            <w:bookmarkStart w:id="1" w:name="_GoBack"/>
+            <w:bookmarkEnd w:id="1"/>
+            <w:r>
+              <w:rPr>
+                <w:rFonts w:cs="Times New Roman"/>
+                <w:szCs w:val="26"/>
+              </w:rPr>
+              <w:t>ố đường cong Elliptic</w:t>
+            </w:r>
+          </w:p>
+        </w:tc>
+      </w:tr>
+      <w:tr>
+        <w:tc>
+          <w:tcPr>
+            <w:tcW w:w="1838" w:type="dxa"/>
+            <w:vAlign w:val="bottom"/>
+          </w:tcPr>
+          <w:p>
+            <w:pPr>
+              <w:spacing w:line="288" w:lineRule="auto"/>
+              <w:rPr>
+                <w:rFonts w:cs="Times New Roman"/>
+                <w:szCs w:val="26"/>
+              </w:rPr>
+            </w:pPr>
+            <w:r>
+              <w:rPr>
+                <w:rFonts w:cs="Times New Roman"/>
+                <w:szCs w:val="26"/>
+              </w:rPr>
+              <w:t>GUI</w:t>
+            </w:r>
+          </w:p>
+        </w:tc>
+        <w:tc>
+          <w:tcPr>
+            <w:tcW w:w="3544" w:type="dxa"/>
+            <w:vAlign w:val="bottom"/>
+          </w:tcPr>
+          <w:p>
+            <w:pPr>
+              <w:spacing w:line="288" w:lineRule="auto"/>
+              <w:rPr>
+                <w:rFonts w:cs="Times New Roman"/>
+                <w:szCs w:val="26"/>
+              </w:rPr>
+            </w:pPr>
+            <w:r>
+              <w:rPr>
+                <w:rFonts w:cs="Times New Roman"/>
+                <w:szCs w:val="26"/>
+              </w:rPr>
+              <w:t>Graphical User Interface</w:t>
+            </w:r>
+          </w:p>
+        </w:tc>
+        <w:tc>
+          <w:tcPr>
+            <w:tcW w:w="3729" w:type="dxa"/>
+            <w:vAlign w:val="bottom"/>
+          </w:tcPr>
+          <w:p>
+            <w:pPr>
+              <w:spacing w:line="288" w:lineRule="auto"/>
+              <w:rPr>
+                <w:rFonts w:cs="Times New Roman"/>
+                <w:szCs w:val="26"/>
+              </w:rPr>
+            </w:pPr>
+            <w:r>
+              <w:rPr>
+                <w:rFonts w:cs="Times New Roman"/>
+                <w:szCs w:val="26"/>
+              </w:rPr>
+              <w:t>Giao diện người dùng đồ họa</w:t>
+            </w:r>
+          </w:p>
+        </w:tc>
+      </w:tr>
+      <w:tr>
+        <w:tc>
+          <w:tcPr>
+            <w:tcW w:w="1838" w:type="dxa"/>
+            <w:vAlign w:val="bottom"/>
+          </w:tcPr>
+          <w:p>
+            <w:pPr>
+              <w:spacing w:line="288" w:lineRule="auto"/>
+              <w:rPr>
+                <w:rFonts w:cs="Times New Roman"/>
+                <w:szCs w:val="26"/>
+              </w:rPr>
+            </w:pPr>
+            <w:r>
+              <w:rPr>
+                <w:rFonts w:cs="Times New Roman"/>
+                <w:szCs w:val="26"/>
+              </w:rPr>
+              <w:t>HMAC</w:t>
+            </w:r>
+          </w:p>
+        </w:tc>
+        <w:tc>
+          <w:tcPr>
+            <w:tcW w:w="3544" w:type="dxa"/>
+            <w:vAlign w:val="bottom"/>
+          </w:tcPr>
+          <w:p>
+            <w:pPr>
+              <w:spacing w:line="288" w:lineRule="auto"/>
+              <w:rPr>
+                <w:rFonts w:cs="Times New Roman"/>
+                <w:szCs w:val="26"/>
+              </w:rPr>
+            </w:pPr>
+            <w:r>
+              <w:rPr>
+                <w:rFonts w:cs="Times New Roman"/>
+                <w:szCs w:val="26"/>
+              </w:rPr>
+              <w:t>Hash-based Message Authentication Code</w:t>
+            </w:r>
+          </w:p>
+        </w:tc>
+        <w:tc>
+          <w:tcPr>
+            <w:tcW w:w="3729" w:type="dxa"/>
+            <w:vAlign w:val="bottom"/>
+          </w:tcPr>
+          <w:p>
+            <w:pPr>
+              <w:spacing w:line="288" w:lineRule="auto"/>
+              <w:rPr>
+                <w:rFonts w:cs="Times New Roman"/>
+                <w:szCs w:val="26"/>
+              </w:rPr>
+            </w:pPr>
+            <w:r>
+              <w:rPr>
+                <w:rFonts w:cs="Times New Roman"/>
+                <w:szCs w:val="26"/>
+              </w:rPr>
+              <w:t>Mã xác thực thông điệp dựa trên hàm băm</w:t>
+            </w:r>
+          </w:p>
+        </w:tc>
+      </w:tr>
+      <w:tr>
+        <w:tc>
+          <w:tcPr>
+            <w:tcW w:w="1838" w:type="dxa"/>
+            <w:vAlign w:val="bottom"/>
+          </w:tcPr>
+          <w:p>
+            <w:pPr>
+              <w:spacing w:line="288" w:lineRule="auto"/>
+              <w:rPr>
+                <w:rFonts w:cs="Times New Roman"/>
+                <w:szCs w:val="26"/>
+              </w:rPr>
+            </w:pPr>
+            <w:r>
+              <w:rPr>
+                <w:rFonts w:cs="Times New Roman"/>
+                <w:szCs w:val="26"/>
+              </w:rPr>
+              <w:t>HTTPS</w:t>
+            </w:r>
+          </w:p>
+        </w:tc>
+        <w:tc>
+          <w:tcPr>
+            <w:tcW w:w="3544" w:type="dxa"/>
+            <w:vAlign w:val="bottom"/>
+          </w:tcPr>
+          <w:p>
+            <w:pPr>
+              <w:spacing w:line="288" w:lineRule="auto"/>
+              <w:rPr>
+                <w:rFonts w:cs="Times New Roman"/>
+                <w:szCs w:val="26"/>
+              </w:rPr>
+            </w:pPr>
+            <w:r>
+              <w:rPr>
+                <w:rFonts w:cs="Times New Roman"/>
+                <w:szCs w:val="26"/>
+              </w:rPr>
+              <w:t>HyperText Transfer Protocol Secure</w:t>
+            </w:r>
+          </w:p>
+        </w:tc>
+        <w:tc>
+          <w:tcPr>
+            <w:tcW w:w="3729" w:type="dxa"/>
+            <w:vAlign w:val="bottom"/>
+          </w:tcPr>
+          <w:p>
+            <w:pPr>
+              <w:spacing w:line="288" w:lineRule="auto"/>
+              <w:rPr>
+                <w:rFonts w:cs="Times New Roman"/>
+                <w:szCs w:val="26"/>
+              </w:rPr>
+            </w:pPr>
+            <w:r>
+              <w:rPr>
+                <w:rFonts w:cs="Times New Roman"/>
+                <w:szCs w:val="26"/>
+              </w:rPr>
+              <w:t>Giao thức truyền tải siêu văn bản an toàn</w:t>
+            </w:r>
+          </w:p>
+        </w:tc>
+      </w:tr>
+      <w:tr>
+        <w:tc>
+          <w:tcPr>
+            <w:tcW w:w="1838" w:type="dxa"/>
+            <w:vAlign w:val="bottom"/>
+          </w:tcPr>
+          <w:p>
+            <w:pPr>
+              <w:spacing w:line="288" w:lineRule="auto"/>
+              <w:rPr>
+                <w:rFonts w:cs="Times New Roman"/>
+                <w:szCs w:val="26"/>
+              </w:rPr>
+            </w:pPr>
+            <w:r>
+              <w:rPr>
+                <w:rFonts w:cs="Times New Roman"/>
+                <w:szCs w:val="26"/>
+              </w:rPr>
+              <w:t>IDS</w:t>
+            </w:r>
+          </w:p>
+        </w:tc>
+        <w:tc>
+          <w:tcPr>
+            <w:tcW w:w="3544" w:type="dxa"/>
+            <w:vAlign w:val="bottom"/>
+          </w:tcPr>
+          <w:p>
+            <w:pPr>
+              <w:spacing w:line="288" w:lineRule="auto"/>
+              <w:rPr>
+                <w:rFonts w:cs="Times New Roman"/>
+                <w:szCs w:val="26"/>
+              </w:rPr>
+            </w:pPr>
+            <w:r>
+              <w:rPr>
+                <w:rFonts w:cs="Times New Roman"/>
+                <w:szCs w:val="26"/>
+              </w:rPr>
+              <w:t>Intrusion Detection System</w:t>
+            </w:r>
+          </w:p>
+        </w:tc>
+        <w:tc>
+          <w:tcPr>
+            <w:tcW w:w="3729" w:type="dxa"/>
+            <w:vAlign w:val="bottom"/>
+          </w:tcPr>
+          <w:p>
+            <w:pPr>
+              <w:spacing w:line="288" w:lineRule="auto"/>
+              <w:rPr>
+                <w:rFonts w:cs="Times New Roman"/>
+                <w:szCs w:val="26"/>
+              </w:rPr>
+            </w:pPr>
+            <w:r>
+              <w:rPr>
+                <w:rFonts w:cs="Times New Roman"/>
+                <w:szCs w:val="26"/>
+              </w:rPr>
+              <w:t>Hệ thống phát hiện xâm nhập</w:t>
+            </w:r>
+          </w:p>
+        </w:tc>
+      </w:tr>
+      <w:tr>
+        <w:tc>
+          <w:tcPr>
+            <w:tcW w:w="1838" w:type="dxa"/>
+            <w:vAlign w:val="bottom"/>
+          </w:tcPr>
+          <w:p>
+            <w:pPr>
+              <w:spacing w:line="288" w:lineRule="auto"/>
+              <w:rPr>
+                <w:rFonts w:cs="Times New Roman"/>
+                <w:szCs w:val="26"/>
+              </w:rPr>
+            </w:pPr>
+            <w:r>
+              <w:rPr>
+                <w:rFonts w:cs="Times New Roman"/>
+                <w:szCs w:val="26"/>
+              </w:rPr>
+              <w:t>IPS</w:t>
+            </w:r>
+          </w:p>
+        </w:tc>
+        <w:tc>
+          <w:tcPr>
+            <w:tcW w:w="3544" w:type="dxa"/>
+            <w:vAlign w:val="bottom"/>
+          </w:tcPr>
+          <w:p>
+            <w:pPr>
+              <w:spacing w:line="288" w:lineRule="auto"/>
+              <w:rPr>
+                <w:rFonts w:cs="Times New Roman"/>
+                <w:szCs w:val="26"/>
+              </w:rPr>
+            </w:pPr>
+            <w:r>
+              <w:rPr>
+                <w:rFonts w:cs="Times New Roman"/>
+                <w:szCs w:val="26"/>
+              </w:rPr>
+              <w:t>Intrusion Prevention System</w:t>
+            </w:r>
+          </w:p>
+        </w:tc>
+        <w:tc>
+          <w:tcPr>
+            <w:tcW w:w="3729" w:type="dxa"/>
+            <w:vAlign w:val="bottom"/>
+          </w:tcPr>
+          <w:p>
+            <w:pPr>
+              <w:spacing w:line="288" w:lineRule="auto"/>
+              <w:rPr>
+                <w:rFonts w:cs="Times New Roman"/>
+                <w:szCs w:val="26"/>
+              </w:rPr>
+            </w:pPr>
+            <w:r>
+              <w:rPr>
+                <w:rFonts w:cs="Times New Roman"/>
+                <w:szCs w:val="26"/>
+              </w:rPr>
+              <w:t>Hệ thống ngăn chặn xâm nhập</w:t>
+            </w:r>
+          </w:p>
+        </w:tc>
+      </w:tr>
+      <w:tr>
+        <w:tc>
+          <w:tcPr>
+            <w:tcW w:w="1838" w:type="dxa"/>
+            <w:vAlign w:val="bottom"/>
+          </w:tcPr>
+          <w:p>
+            <w:pPr>
+              <w:spacing w:line="288" w:lineRule="auto"/>
+              <w:rPr>
+                <w:rFonts w:cs="Times New Roman"/>
+                <w:szCs w:val="26"/>
+              </w:rPr>
+            </w:pPr>
+            <w:r>
+              <w:rPr>
+                <w:rFonts w:cs="Times New Roman"/>
+                <w:szCs w:val="26"/>
+              </w:rPr>
+              <w:t>IoT</w:t>
+            </w:r>
+          </w:p>
+        </w:tc>
+        <w:tc>
+          <w:tcPr>
+            <w:tcW w:w="3544" w:type="dxa"/>
+            <w:vAlign w:val="bottom"/>
+          </w:tcPr>
+          <w:p>
+            <w:pPr>
+              <w:spacing w:line="288" w:lineRule="auto"/>
+              <w:rPr>
+                <w:rFonts w:cs="Times New Roman"/>
+                <w:szCs w:val="26"/>
+              </w:rPr>
+            </w:pPr>
+            <w:r>
+              <w:rPr>
+                <w:rFonts w:cs="Times New Roman"/>
+                <w:szCs w:val="26"/>
+              </w:rPr>
+              <w:t>Internet of Things</w:t>
+            </w:r>
+          </w:p>
+        </w:tc>
+        <w:tc>
+          <w:tcPr>
+            <w:tcW w:w="3729" w:type="dxa"/>
+            <w:vAlign w:val="bottom"/>
+          </w:tcPr>
+          <w:p>
+            <w:pPr>
+              <w:spacing w:line="288" w:lineRule="auto"/>
+              <w:rPr>
+                <w:rFonts w:cs="Times New Roman"/>
+                <w:szCs w:val="26"/>
+              </w:rPr>
+            </w:pPr>
+            <w:r>
+              <w:rPr>
+                <w:rFonts w:cs="Times New Roman"/>
+                <w:szCs w:val="26"/>
+              </w:rPr>
+              <w:t>Internet vạn vật</w:t>
+            </w:r>
+          </w:p>
+        </w:tc>
+      </w:tr>
+      <w:tr>
+        <w:tc>
+          <w:tcPr>
+            <w:tcW w:w="1838" w:type="dxa"/>
+            <w:vAlign w:val="bottom"/>
+          </w:tcPr>
+          <w:p>
+            <w:pPr>
+              <w:spacing w:line="288" w:lineRule="auto"/>
+              <w:rPr>
+                <w:rFonts w:cs="Times New Roman"/>
+                <w:szCs w:val="26"/>
+              </w:rPr>
+            </w:pPr>
+            <w:r>
+              <w:rPr>
+                <w:rFonts w:cs="Times New Roman"/>
+                <w:szCs w:val="26"/>
+              </w:rPr>
+              <w:t>JCA</w:t>
+            </w:r>
+          </w:p>
+        </w:tc>
+        <w:tc>
+          <w:tcPr>
+            <w:tcW w:w="3544" w:type="dxa"/>
+            <w:vAlign w:val="bottom"/>
+          </w:tcPr>
+          <w:p>
+            <w:pPr>
+              <w:spacing w:line="288" w:lineRule="auto"/>
+              <w:rPr>
+                <w:rFonts w:cs="Times New Roman"/>
+                <w:szCs w:val="26"/>
+              </w:rPr>
+            </w:pPr>
+            <w:r>
+              <w:rPr>
+                <w:rFonts w:cs="Times New Roman"/>
+                <w:szCs w:val="26"/>
+              </w:rPr>
+              <w:t>Java Cryptography Architecture</w:t>
+            </w:r>
+          </w:p>
+        </w:tc>
+        <w:tc>
+          <w:tcPr>
+            <w:tcW w:w="3729" w:type="dxa"/>
+            <w:vAlign w:val="bottom"/>
+          </w:tcPr>
+          <w:p>
+            <w:pPr>
+              <w:spacing w:line="288" w:lineRule="auto"/>
+              <w:rPr>
+                <w:rFonts w:cs="Times New Roman"/>
+                <w:szCs w:val="26"/>
+              </w:rPr>
+            </w:pPr>
+            <w:r>
+              <w:rPr>
+                <w:rFonts w:cs="Times New Roman"/>
+                <w:szCs w:val="26"/>
+              </w:rPr>
+              <w:t>Kiến trúc mật mã Java</w:t>
+            </w:r>
+          </w:p>
+        </w:tc>
+      </w:tr>
+      <w:tr>
+        <w:tc>
+          <w:tcPr>
+            <w:tcW w:w="1838" w:type="dxa"/>
+            <w:vAlign w:val="bottom"/>
+          </w:tcPr>
+          <w:p>
+            <w:pPr>
+              <w:spacing w:line="288" w:lineRule="auto"/>
+              <w:rPr>
+                <w:rFonts w:cs="Times New Roman"/>
+                <w:szCs w:val="26"/>
+              </w:rPr>
+            </w:pPr>
+            <w:r>
+              <w:rPr>
+                <w:rFonts w:cs="Times New Roman"/>
+                <w:szCs w:val="26"/>
+              </w:rPr>
+              <w:t>JCE</w:t>
+            </w:r>
+          </w:p>
+        </w:tc>
+        <w:tc>
+          <w:tcPr>
+            <w:tcW w:w="3544" w:type="dxa"/>
+            <w:vAlign w:val="bottom"/>
+          </w:tcPr>
+          <w:p>
+            <w:pPr>
+              <w:spacing w:line="288" w:lineRule="auto"/>
+              <w:rPr>
+                <w:rFonts w:cs="Times New Roman"/>
+                <w:szCs w:val="26"/>
+              </w:rPr>
+            </w:pPr>
+            <w:r>
+              <w:rPr>
+                <w:rFonts w:cs="Times New Roman"/>
+                <w:szCs w:val="26"/>
+              </w:rPr>
+              <w:t>Java Cryptography Extension</w:t>
+            </w:r>
+          </w:p>
+        </w:tc>
+        <w:tc>
+          <w:tcPr>
+            <w:tcW w:w="3729" w:type="dxa"/>
+            <w:vAlign w:val="bottom"/>
+          </w:tcPr>
+          <w:p>
+            <w:pPr>
+              <w:spacing w:line="288" w:lineRule="auto"/>
+              <w:rPr>
+                <w:rFonts w:cs="Times New Roman"/>
+                <w:szCs w:val="26"/>
+              </w:rPr>
+            </w:pPr>
+            <w:r>
+              <w:rPr>
+                <w:rFonts w:cs="Times New Roman"/>
+                <w:szCs w:val="26"/>
+              </w:rPr>
+              <w:t>Phần mở rộng mật mã Java</w:t>
+            </w:r>
+          </w:p>
+        </w:tc>
+      </w:tr>
+      <w:tr>
+        <w:tc>
+          <w:tcPr>
+            <w:tcW w:w="1838" w:type="dxa"/>
+            <w:vAlign w:val="bottom"/>
+          </w:tcPr>
+          <w:p>
+            <w:pPr>
+              <w:spacing w:line="288" w:lineRule="auto"/>
+              <w:rPr>
+                <w:rFonts w:cs="Times New Roman"/>
+                <w:szCs w:val="26"/>
+              </w:rPr>
+            </w:pPr>
+            <w:r>
+              <w:rPr>
+                <w:rFonts w:cs="Times New Roman"/>
+                <w:szCs w:val="26"/>
+              </w:rPr>
+              <w:t>JVM</w:t>
+            </w:r>
+          </w:p>
+        </w:tc>
+        <w:tc>
+          <w:tcPr>
+            <w:tcW w:w="3544" w:type="dxa"/>
+            <w:vAlign w:val="bottom"/>
+          </w:tcPr>
+          <w:p>
+            <w:pPr>
+              <w:spacing w:line="288" w:lineRule="auto"/>
+              <w:rPr>
+                <w:rFonts w:cs="Times New Roman"/>
+                <w:szCs w:val="26"/>
+              </w:rPr>
+            </w:pPr>
+            <w:r>
+              <w:rPr>
+                <w:rFonts w:cs="Times New Roman"/>
+                <w:szCs w:val="26"/>
+              </w:rPr>
+              <w:t>Java Virtual Machine</w:t>
+            </w:r>
+          </w:p>
+        </w:tc>
+        <w:tc>
+          <w:tcPr>
+            <w:tcW w:w="3729" w:type="dxa"/>
+            <w:vAlign w:val="bottom"/>
+          </w:tcPr>
+          <w:p>
+            <w:pPr>
+              <w:spacing w:line="288" w:lineRule="auto"/>
+              <w:rPr>
+                <w:rFonts w:cs="Times New Roman"/>
+                <w:szCs w:val="26"/>
+              </w:rPr>
+            </w:pPr>
+            <w:r>
+              <w:rPr>
+                <w:rFonts w:cs="Times New Roman"/>
+                <w:szCs w:val="26"/>
+              </w:rPr>
+              <w:t>Máy ảo Java</w:t>
+            </w:r>
+          </w:p>
+        </w:tc>
+      </w:tr>
+      <w:tr>
+        <w:tc>
+          <w:tcPr>
+            <w:tcW w:w="1838" w:type="dxa"/>
+            <w:vAlign w:val="bottom"/>
+          </w:tcPr>
+          <w:p>
+            <w:pPr>
+              <w:spacing w:line="288" w:lineRule="auto"/>
+              <w:rPr>
+                <w:rFonts w:cs="Times New Roman"/>
+                <w:szCs w:val="26"/>
+              </w:rPr>
+            </w:pPr>
+            <w:r>
+              <w:rPr>
+                <w:rFonts w:cs="Times New Roman"/>
+                <w:szCs w:val="26"/>
+              </w:rPr>
+              <w:t>MD5</w:t>
+            </w:r>
+          </w:p>
+        </w:tc>
+        <w:tc>
+          <w:tcPr>
+            <w:tcW w:w="3544" w:type="dxa"/>
+            <w:vAlign w:val="bottom"/>
+          </w:tcPr>
+          <w:p>
+            <w:pPr>
+              <w:spacing w:line="288" w:lineRule="auto"/>
+              <w:rPr>
+                <w:rFonts w:cs="Times New Roman"/>
+                <w:szCs w:val="26"/>
+              </w:rPr>
+            </w:pPr>
+            <w:r>
+              <w:rPr>
+                <w:rFonts w:cs="Times New Roman"/>
+                <w:szCs w:val="26"/>
+              </w:rPr>
+              <w:t>Message Digest Algorithm 5</w:t>
+            </w:r>
+          </w:p>
+        </w:tc>
+        <w:tc>
+          <w:tcPr>
+            <w:tcW w:w="3729" w:type="dxa"/>
+            <w:vAlign w:val="bottom"/>
+          </w:tcPr>
+          <w:p>
+            <w:pPr>
+              <w:spacing w:line="288" w:lineRule="auto"/>
+              <w:rPr>
+                <w:rFonts w:cs="Times New Roman"/>
+                <w:szCs w:val="26"/>
+              </w:rPr>
+            </w:pPr>
+            <w:r>
+              <w:rPr>
+                <w:rFonts w:cs="Times New Roman"/>
+                <w:szCs w:val="26"/>
+              </w:rPr>
+              <w:t>Thuật toán băm MD5</w:t>
+            </w:r>
+          </w:p>
+        </w:tc>
+      </w:tr>
+      <w:tr>
+        <w:tc>
+          <w:tcPr>
+            <w:tcW w:w="1838" w:type="dxa"/>
+            <w:vAlign w:val="bottom"/>
+          </w:tcPr>
+          <w:p>
+            <w:pPr>
+              <w:spacing w:line="288" w:lineRule="auto"/>
+              <w:rPr>
+                <w:rFonts w:cs="Times New Roman"/>
+                <w:szCs w:val="26"/>
+              </w:rPr>
+            </w:pPr>
+            <w:r>
+              <w:rPr>
+                <w:rFonts w:cs="Times New Roman"/>
+                <w:szCs w:val="26"/>
+              </w:rPr>
+              <w:t>NIST</w:t>
+            </w:r>
+          </w:p>
+        </w:tc>
+        <w:tc>
+          <w:tcPr>
+            <w:tcW w:w="3544" w:type="dxa"/>
+            <w:vAlign w:val="bottom"/>
+          </w:tcPr>
+          <w:p>
+            <w:pPr>
+              <w:spacing w:line="288" w:lineRule="auto"/>
+              <w:rPr>
+                <w:rFonts w:cs="Times New Roman"/>
+                <w:szCs w:val="26"/>
+              </w:rPr>
+            </w:pPr>
+            <w:r>
+              <w:rPr>
+                <w:rFonts w:cs="Times New Roman"/>
+                <w:szCs w:val="26"/>
+              </w:rPr>
+              <w:t>National Institute of Standards and Technology</w:t>
+            </w:r>
+          </w:p>
+        </w:tc>
+        <w:tc>
+          <w:tcPr>
+            <w:tcW w:w="3729" w:type="dxa"/>
+            <w:vAlign w:val="bottom"/>
+          </w:tcPr>
+          <w:p>
+            <w:pPr>
+              <w:spacing w:line="288" w:lineRule="auto"/>
+              <w:rPr>
+                <w:rFonts w:cs="Times New Roman"/>
+                <w:szCs w:val="26"/>
+              </w:rPr>
+            </w:pPr>
+            <w:r>
+              <w:rPr>
+                <w:rFonts w:cs="Times New Roman"/>
+                <w:szCs w:val="26"/>
+              </w:rPr>
+              <w:t>Viện Tiêu chuẩn và Công nghệ Quốc gia Hoa Kỳ</w:t>
+            </w:r>
+          </w:p>
+        </w:tc>
+      </w:tr>
+      <w:tr>
+        <w:tc>
+          <w:tcPr>
+            <w:tcW w:w="1838" w:type="dxa"/>
+            <w:vAlign w:val="bottom"/>
+          </w:tcPr>
+          <w:p>
+            <w:pPr>
+              <w:spacing w:line="288" w:lineRule="auto"/>
+              <w:rPr>
+                <w:rFonts w:cs="Times New Roman"/>
+                <w:szCs w:val="26"/>
+              </w:rPr>
+            </w:pPr>
+            <w:r>
+              <w:rPr>
+                <w:rFonts w:cs="Times New Roman"/>
+                <w:szCs w:val="26"/>
+              </w:rPr>
+              <w:t>NSec</w:t>
+            </w:r>
+          </w:p>
+        </w:tc>
+        <w:tc>
+          <w:tcPr>
+            <w:tcW w:w="3544" w:type="dxa"/>
+            <w:vAlign w:val="bottom"/>
+          </w:tcPr>
+          <w:p>
+            <w:pPr>
+              <w:spacing w:line="288" w:lineRule="auto"/>
+              <w:rPr>
+                <w:rFonts w:cs="Times New Roman"/>
+                <w:szCs w:val="26"/>
+              </w:rPr>
+            </w:pPr>
+            <w:r>
+              <w:rPr>
+                <w:rFonts w:cs="Times New Roman"/>
+                <w:szCs w:val="26"/>
+              </w:rPr>
+              <w:t>NSec Cryptography</w:t>
+            </w:r>
+          </w:p>
+        </w:tc>
+        <w:tc>
+          <w:tcPr>
+            <w:tcW w:w="3729" w:type="dxa"/>
+            <w:vAlign w:val="bottom"/>
+          </w:tcPr>
+          <w:p>
+            <w:pPr>
+              <w:spacing w:line="288" w:lineRule="auto"/>
+              <w:rPr>
+                <w:rFonts w:cs="Times New Roman"/>
+                <w:szCs w:val="26"/>
+              </w:rPr>
+            </w:pPr>
+            <w:r>
+              <w:rPr>
+                <w:rFonts w:cs="Times New Roman"/>
+                <w:szCs w:val="26"/>
+              </w:rPr>
+              <w:t>Thư viện mật mã NSec</w:t>
+            </w:r>
+          </w:p>
+        </w:tc>
+      </w:tr>
+      <w:tr>
+        <w:tc>
+          <w:tcPr>
+            <w:tcW w:w="1838" w:type="dxa"/>
+            <w:vAlign w:val="bottom"/>
+          </w:tcPr>
+          <w:p>
+            <w:pPr>
+              <w:spacing w:line="288" w:lineRule="auto"/>
+              <w:rPr>
+                <w:rFonts w:cs="Times New Roman"/>
+                <w:szCs w:val="26"/>
+              </w:rPr>
+            </w:pPr>
+            <w:r>
+              <w:rPr>
+                <w:rFonts w:cs="Times New Roman"/>
+                <w:szCs w:val="26"/>
+              </w:rPr>
+              <w:t>PDF</w:t>
+            </w:r>
+          </w:p>
+        </w:tc>
+        <w:tc>
+          <w:tcPr>
+            <w:tcW w:w="3544" w:type="dxa"/>
+            <w:vAlign w:val="bottom"/>
+          </w:tcPr>
+          <w:p>
+            <w:pPr>
+              <w:spacing w:line="288" w:lineRule="auto"/>
+              <w:rPr>
+                <w:rFonts w:cs="Times New Roman"/>
+                <w:szCs w:val="26"/>
+              </w:rPr>
+            </w:pPr>
+            <w:r>
+              <w:rPr>
+                <w:rFonts w:cs="Times New Roman"/>
+                <w:szCs w:val="26"/>
+              </w:rPr>
+              <w:t>Portable Document Format</w:t>
+            </w:r>
+          </w:p>
+        </w:tc>
+        <w:tc>
+          <w:tcPr>
+            <w:tcW w:w="3729" w:type="dxa"/>
+            <w:vAlign w:val="bottom"/>
+          </w:tcPr>
+          <w:p>
+            <w:pPr>
+              <w:spacing w:line="288" w:lineRule="auto"/>
+              <w:rPr>
+                <w:rFonts w:cs="Times New Roman"/>
+                <w:szCs w:val="26"/>
+              </w:rPr>
+            </w:pPr>
+            <w:r>
+              <w:rPr>
+                <w:rFonts w:cs="Times New Roman"/>
+                <w:szCs w:val="26"/>
+              </w:rPr>
+              <w:t>Định dạng tài liệu di động</w:t>
+            </w:r>
+          </w:p>
+        </w:tc>
+      </w:tr>
+      <w:tr>
+        <w:tc>
+          <w:tcPr>
+            <w:tcW w:w="1838" w:type="dxa"/>
+            <w:vAlign w:val="bottom"/>
+          </w:tcPr>
+          <w:p>
+            <w:pPr>
+              <w:spacing w:line="288" w:lineRule="auto"/>
+              <w:rPr>
+                <w:rFonts w:cs="Times New Roman"/>
+                <w:szCs w:val="26"/>
+              </w:rPr>
+            </w:pPr>
+            <w:r>
+              <w:rPr>
+                <w:rFonts w:cs="Times New Roman"/>
+                <w:szCs w:val="26"/>
+              </w:rPr>
+              <w:t>PKI</w:t>
+            </w:r>
+          </w:p>
+        </w:tc>
+        <w:tc>
+          <w:tcPr>
+            <w:tcW w:w="3544" w:type="dxa"/>
+            <w:vAlign w:val="bottom"/>
+          </w:tcPr>
+          <w:p>
+            <w:pPr>
+              <w:spacing w:line="288" w:lineRule="auto"/>
+              <w:rPr>
+                <w:rFonts w:cs="Times New Roman"/>
+                <w:szCs w:val="26"/>
+              </w:rPr>
+            </w:pPr>
+            <w:r>
+              <w:rPr>
+                <w:rFonts w:cs="Times New Roman"/>
+                <w:szCs w:val="26"/>
+              </w:rPr>
+              <w:t>Public Key Infrastructure</w:t>
+            </w:r>
+          </w:p>
+        </w:tc>
+        <w:tc>
+          <w:tcPr>
+            <w:tcW w:w="3729" w:type="dxa"/>
+            <w:vAlign w:val="bottom"/>
+          </w:tcPr>
+          <w:p>
+            <w:pPr>
+              <w:spacing w:line="288" w:lineRule="auto"/>
+              <w:rPr>
+                <w:rFonts w:cs="Times New Roman"/>
+                <w:szCs w:val="26"/>
+              </w:rPr>
+            </w:pPr>
+            <w:r>
+              <w:rPr>
+                <w:rFonts w:cs="Times New Roman"/>
+                <w:szCs w:val="26"/>
+              </w:rPr>
+              <w:t>Hạ tầng khóa công khai</w:t>
+            </w:r>
+          </w:p>
+        </w:tc>
+      </w:tr>
+      <w:tr>
+        <w:tc>
+          <w:tcPr>
+            <w:tcW w:w="1838" w:type="dxa"/>
+            <w:vAlign w:val="bottom"/>
+          </w:tcPr>
+          <w:p>
+            <w:pPr>
+              <w:spacing w:line="288" w:lineRule="auto"/>
+              <w:rPr>
+                <w:rFonts w:cs="Times New Roman"/>
+                <w:szCs w:val="26"/>
+              </w:rPr>
+            </w:pPr>
+            <w:r>
+              <w:rPr>
+                <w:rFonts w:cs="Times New Roman"/>
+                <w:szCs w:val="26"/>
+              </w:rPr>
+              <w:t>RSA</w:t>
+            </w:r>
+          </w:p>
+        </w:tc>
+        <w:tc>
+          <w:tcPr>
+            <w:tcW w:w="3544" w:type="dxa"/>
+            <w:vAlign w:val="bottom"/>
+          </w:tcPr>
+          <w:p>
+            <w:pPr>
+              <w:spacing w:line="288" w:lineRule="auto"/>
+              <w:rPr>
+                <w:rFonts w:cs="Times New Roman"/>
+                <w:szCs w:val="26"/>
+              </w:rPr>
+            </w:pPr>
+            <w:r>
+              <w:rPr>
+                <w:rFonts w:cs="Times New Roman"/>
+                <w:szCs w:val="26"/>
+              </w:rPr>
+              <w:t>Rivest–Shamir–Adleman</w:t>
+            </w:r>
+          </w:p>
+        </w:tc>
+        <w:tc>
+          <w:tcPr>
+            <w:tcW w:w="3729" w:type="dxa"/>
+            <w:vAlign w:val="bottom"/>
+          </w:tcPr>
+          <w:p>
+            <w:pPr>
+              <w:spacing w:line="288" w:lineRule="auto"/>
+              <w:rPr>
+                <w:rFonts w:cs="Times New Roman"/>
+                <w:szCs w:val="26"/>
+              </w:rPr>
+            </w:pPr>
+            <w:r>
+              <w:rPr>
+                <w:rFonts w:cs="Times New Roman"/>
+                <w:szCs w:val="26"/>
+              </w:rPr>
+              <w:t>Hệ mật mã khóa công khai RSA</w:t>
+            </w:r>
+          </w:p>
+        </w:tc>
+      </w:tr>
+      <w:tr>
+        <w:tc>
+          <w:tcPr>
+            <w:tcW w:w="1838" w:type="dxa"/>
+            <w:vAlign w:val="bottom"/>
+          </w:tcPr>
+          <w:p>
+            <w:pPr>
+              <w:spacing w:line="288" w:lineRule="auto"/>
+              <w:rPr>
+                <w:rFonts w:cs="Times New Roman"/>
+                <w:szCs w:val="26"/>
+              </w:rPr>
+            </w:pPr>
+            <w:r>
+              <w:rPr>
+                <w:rFonts w:cs="Times New Roman"/>
+                <w:szCs w:val="26"/>
+              </w:rPr>
+              <w:t>SHA</w:t>
+            </w:r>
+          </w:p>
+        </w:tc>
+        <w:tc>
+          <w:tcPr>
+            <w:tcW w:w="3544" w:type="dxa"/>
+            <w:vAlign w:val="bottom"/>
+          </w:tcPr>
+          <w:p>
+            <w:pPr>
+              <w:spacing w:line="288" w:lineRule="auto"/>
+              <w:rPr>
+                <w:rFonts w:cs="Times New Roman"/>
+                <w:szCs w:val="26"/>
+              </w:rPr>
+            </w:pPr>
+            <w:r>
+              <w:rPr>
+                <w:rFonts w:cs="Times New Roman"/>
+                <w:szCs w:val="26"/>
+              </w:rPr>
+              <w:t>Secure Hash Algorithm</w:t>
+            </w:r>
+          </w:p>
+        </w:tc>
+        <w:tc>
+          <w:tcPr>
+            <w:tcW w:w="3729" w:type="dxa"/>
+            <w:vAlign w:val="bottom"/>
+          </w:tcPr>
+          <w:p>
+            <w:pPr>
+              <w:spacing w:line="288" w:lineRule="auto"/>
+              <w:rPr>
+                <w:rFonts w:cs="Times New Roman"/>
+                <w:szCs w:val="26"/>
+              </w:rPr>
+            </w:pPr>
+            <w:r>
+              <w:rPr>
+                <w:rFonts w:cs="Times New Roman"/>
+                <w:szCs w:val="26"/>
+              </w:rPr>
+              <w:t>Thuật toán băm an toàn</w:t>
+            </w:r>
+          </w:p>
+        </w:tc>
+      </w:tr>
+      <w:tr>
+        <w:tc>
+          <w:tcPr>
+            <w:tcW w:w="1838" w:type="dxa"/>
+            <w:vAlign w:val="bottom"/>
+          </w:tcPr>
+          <w:p>
+            <w:pPr>
+              <w:spacing w:line="288" w:lineRule="auto"/>
+              <w:rPr>
+                <w:rFonts w:cs="Times New Roman"/>
+                <w:szCs w:val="26"/>
+              </w:rPr>
+            </w:pPr>
+            <w:r>
+              <w:rPr>
+                <w:rFonts w:cs="Times New Roman"/>
+                <w:szCs w:val="26"/>
+              </w:rPr>
+              <w:t>SHA-256</w:t>
+            </w:r>
+          </w:p>
+        </w:tc>
+        <w:tc>
+          <w:tcPr>
+            <w:tcW w:w="3544" w:type="dxa"/>
+            <w:vAlign w:val="bottom"/>
+          </w:tcPr>
+          <w:p>
+            <w:pPr>
+              <w:spacing w:line="288" w:lineRule="auto"/>
+              <w:rPr>
+                <w:rFonts w:cs="Times New Roman"/>
+                <w:szCs w:val="26"/>
+              </w:rPr>
+            </w:pPr>
+            <w:r>
+              <w:rPr>
+                <w:rFonts w:cs="Times New Roman"/>
+                <w:szCs w:val="26"/>
+              </w:rPr>
+              <w:t>Secure Hash Algorithm 256-bit</w:t>
+            </w:r>
+          </w:p>
+        </w:tc>
+        <w:tc>
+          <w:tcPr>
+            <w:tcW w:w="3729" w:type="dxa"/>
+            <w:vAlign w:val="bottom"/>
+          </w:tcPr>
+          <w:p>
+            <w:pPr>
+              <w:spacing w:line="288" w:lineRule="auto"/>
+              <w:rPr>
+                <w:rFonts w:cs="Times New Roman"/>
+                <w:szCs w:val="26"/>
+              </w:rPr>
+            </w:pPr>
+            <w:r>
+              <w:rPr>
+                <w:rFonts w:cs="Times New Roman"/>
+                <w:szCs w:val="26"/>
+              </w:rPr>
+              <w:t>Thuật toán băm SHA-256</w:t>
+            </w:r>
+          </w:p>
+        </w:tc>
+      </w:tr>
+      <w:tr>
+        <w:tc>
+          <w:tcPr>
+            <w:tcW w:w="1838" w:type="dxa"/>
+            <w:vAlign w:val="bottom"/>
+          </w:tcPr>
+          <w:p>
+            <w:pPr>
+              <w:spacing w:line="288" w:lineRule="auto"/>
+              <w:rPr>
+                <w:rFonts w:cs="Times New Roman"/>
+                <w:szCs w:val="26"/>
+              </w:rPr>
+            </w:pPr>
+            <w:r>
+              <w:rPr>
+                <w:rFonts w:cs="Times New Roman"/>
+                <w:szCs w:val="26"/>
+              </w:rPr>
+              <w:t>SHA-512</w:t>
+            </w:r>
+          </w:p>
+        </w:tc>
+        <w:tc>
+          <w:tcPr>
+            <w:tcW w:w="3544" w:type="dxa"/>
+            <w:vAlign w:val="bottom"/>
+          </w:tcPr>
+          <w:p>
+            <w:pPr>
+              <w:spacing w:line="288" w:lineRule="auto"/>
+              <w:rPr>
+                <w:rFonts w:cs="Times New Roman"/>
+                <w:szCs w:val="26"/>
+              </w:rPr>
+            </w:pPr>
+            <w:r>
+              <w:rPr>
+                <w:rFonts w:cs="Times New Roman"/>
+                <w:szCs w:val="26"/>
+              </w:rPr>
+              <w:t>Secure Hash Algorithm 512-bit</w:t>
+            </w:r>
+          </w:p>
+        </w:tc>
+        <w:tc>
+          <w:tcPr>
+            <w:tcW w:w="3729" w:type="dxa"/>
+            <w:vAlign w:val="bottom"/>
+          </w:tcPr>
+          <w:p>
+            <w:pPr>
+              <w:spacing w:line="288" w:lineRule="auto"/>
+              <w:rPr>
+                <w:rFonts w:cs="Times New Roman"/>
+                <w:szCs w:val="26"/>
+              </w:rPr>
+            </w:pPr>
+            <w:r>
+              <w:rPr>
+                <w:rFonts w:cs="Times New Roman"/>
+                <w:szCs w:val="26"/>
+              </w:rPr>
+              <w:t>Thuật toán băm SHA-512</w:t>
+            </w:r>
+          </w:p>
+        </w:tc>
+      </w:tr>
+      <w:tr>
+        <w:tc>
+          <w:tcPr>
+            <w:tcW w:w="1838" w:type="dxa"/>
+            <w:vAlign w:val="bottom"/>
+          </w:tcPr>
+          <w:p>
+            <w:pPr>
+              <w:spacing w:line="288" w:lineRule="auto"/>
+              <w:rPr>
+                <w:rFonts w:cs="Times New Roman"/>
+                <w:szCs w:val="26"/>
+              </w:rPr>
+            </w:pPr>
+            <w:r>
+              <w:rPr>
+                <w:rFonts w:cs="Times New Roman"/>
+                <w:szCs w:val="26"/>
+              </w:rPr>
+              <w:t>SSL</w:t>
+            </w:r>
+          </w:p>
+        </w:tc>
+        <w:tc>
+          <w:tcPr>
+            <w:tcW w:w="3544" w:type="dxa"/>
+            <w:vAlign w:val="bottom"/>
+          </w:tcPr>
+          <w:p>
+            <w:pPr>
+              <w:spacing w:line="288" w:lineRule="auto"/>
+              <w:rPr>
+                <w:rFonts w:cs="Times New Roman"/>
+                <w:szCs w:val="26"/>
+              </w:rPr>
+            </w:pPr>
+            <w:r>
+              <w:rPr>
+                <w:rFonts w:cs="Times New Roman"/>
+                <w:szCs w:val="26"/>
+              </w:rPr>
+              <w:t>Secure Sockets Layer</w:t>
+            </w:r>
+          </w:p>
+        </w:tc>
+        <w:tc>
+          <w:tcPr>
+            <w:tcW w:w="3729" w:type="dxa"/>
+            <w:vAlign w:val="bottom"/>
+          </w:tcPr>
+          <w:p>
+            <w:pPr>
+              <w:spacing w:line="288" w:lineRule="auto"/>
+              <w:rPr>
+                <w:rFonts w:cs="Times New Roman"/>
+                <w:szCs w:val="26"/>
+              </w:rPr>
+            </w:pPr>
+            <w:r>
+              <w:rPr>
+                <w:rFonts w:cs="Times New Roman"/>
+                <w:szCs w:val="26"/>
+              </w:rPr>
+              <w:t>Giao thức bảo mật SSL</w:t>
+            </w:r>
+          </w:p>
+        </w:tc>
+      </w:tr>
+      <w:tr>
+        <w:tc>
+          <w:tcPr>
+            <w:tcW w:w="1838" w:type="dxa"/>
+            <w:vAlign w:val="bottom"/>
+          </w:tcPr>
+          <w:p>
+            <w:pPr>
+              <w:spacing w:line="288" w:lineRule="auto"/>
+              <w:rPr>
+                <w:rFonts w:cs="Times New Roman"/>
+                <w:szCs w:val="26"/>
+              </w:rPr>
+            </w:pPr>
+            <w:r>
+              <w:rPr>
+                <w:rFonts w:cs="Times New Roman"/>
+                <w:szCs w:val="26"/>
+              </w:rPr>
+              <w:t>TLS</w:t>
+            </w:r>
+          </w:p>
+        </w:tc>
+        <w:tc>
+          <w:tcPr>
+            <w:tcW w:w="3544" w:type="dxa"/>
+            <w:vAlign w:val="bottom"/>
+          </w:tcPr>
+          <w:p>
+            <w:pPr>
+              <w:spacing w:line="288" w:lineRule="auto"/>
+              <w:rPr>
+                <w:rFonts w:cs="Times New Roman"/>
+                <w:szCs w:val="26"/>
+              </w:rPr>
+            </w:pPr>
+            <w:r>
+              <w:rPr>
+                <w:rFonts w:cs="Times New Roman"/>
+                <w:szCs w:val="26"/>
+              </w:rPr>
+              <w:t>Transport Layer Security</w:t>
+            </w:r>
+          </w:p>
+        </w:tc>
+        <w:tc>
+          <w:tcPr>
+            <w:tcW w:w="3729" w:type="dxa"/>
+            <w:vAlign w:val="bottom"/>
+          </w:tcPr>
+          <w:p>
+            <w:pPr>
+              <w:spacing w:line="288" w:lineRule="auto"/>
+              <w:rPr>
+                <w:rFonts w:cs="Times New Roman"/>
+                <w:szCs w:val="26"/>
+              </w:rPr>
+            </w:pPr>
+            <w:r>
+              <w:rPr>
+                <w:rFonts w:cs="Times New Roman"/>
+                <w:szCs w:val="26"/>
+              </w:rPr>
+              <w:t>Bảo mật tầng vận chuyển</w:t>
+            </w:r>
+          </w:p>
+        </w:tc>
+      </w:tr>
+      <w:tr>
+        <w:tc>
+          <w:tcPr>
+            <w:tcW w:w="1838" w:type="dxa"/>
+            <w:vAlign w:val="bottom"/>
+          </w:tcPr>
+          <w:p>
+            <w:pPr>
+              <w:spacing w:line="288" w:lineRule="auto"/>
+              <w:rPr>
+                <w:rFonts w:cs="Times New Roman"/>
+                <w:szCs w:val="26"/>
+              </w:rPr>
+            </w:pPr>
+            <w:r>
+              <w:rPr>
+                <w:rFonts w:cs="Times New Roman"/>
+                <w:szCs w:val="26"/>
+              </w:rPr>
+              <w:t>WPF</w:t>
+            </w:r>
+          </w:p>
+        </w:tc>
+        <w:tc>
+          <w:tcPr>
+            <w:tcW w:w="3544" w:type="dxa"/>
+            <w:vAlign w:val="bottom"/>
+          </w:tcPr>
+          <w:p>
+            <w:pPr>
+              <w:spacing w:line="288" w:lineRule="auto"/>
+              <w:rPr>
+                <w:rFonts w:cs="Times New Roman"/>
+                <w:szCs w:val="26"/>
+              </w:rPr>
+            </w:pPr>
+            <w:r>
+              <w:rPr>
+                <w:rFonts w:cs="Times New Roman"/>
+                <w:szCs w:val="26"/>
+              </w:rPr>
+              <w:t>Windows Presentation Foundation</w:t>
+            </w:r>
+          </w:p>
+        </w:tc>
+        <w:tc>
+          <w:tcPr>
+            <w:tcW w:w="3729" w:type="dxa"/>
+            <w:vAlign w:val="bottom"/>
+          </w:tcPr>
+          <w:p>
+            <w:pPr>
+              <w:spacing w:line="288" w:lineRule="auto"/>
+              <w:rPr>
+                <w:rFonts w:cs="Times New Roman"/>
+                <w:szCs w:val="26"/>
+              </w:rPr>
+            </w:pPr>
+            <w:r>
+              <w:rPr>
+                <w:rFonts w:cs="Times New Roman"/>
+                <w:szCs w:val="26"/>
+              </w:rPr>
+              <w:t>Nền tảng xây dựng giao diện Windows</w:t>
+            </w:r>
+          </w:p>
+        </w:tc>
+      </w:tr>
+      <w:tr>
+        <w:tc>
+          <w:tcPr>
+            <w:tcW w:w="1838" w:type="dxa"/>
+            <w:vAlign w:val="bottom"/>
+          </w:tcPr>
+          <w:p>
+            <w:pPr>
+              <w:spacing w:line="288" w:lineRule="auto"/>
+              <w:rPr>
+                <w:rFonts w:cs="Times New Roman"/>
+                <w:szCs w:val="26"/>
+              </w:rPr>
+            </w:pPr>
+            <w:r>
+              <w:rPr>
+                <w:rFonts w:cs="Times New Roman"/>
+                <w:szCs w:val="26"/>
+              </w:rPr>
+              <w:t>IDE</w:t>
+            </w:r>
+          </w:p>
+        </w:tc>
+        <w:tc>
+          <w:tcPr>
+            <w:tcW w:w="3544" w:type="dxa"/>
+            <w:vAlign w:val="bottom"/>
+          </w:tcPr>
+          <w:p>
+            <w:pPr>
+              <w:spacing w:line="288" w:lineRule="auto"/>
+              <w:rPr>
+                <w:rFonts w:cs="Times New Roman"/>
+                <w:szCs w:val="26"/>
+              </w:rPr>
+            </w:pPr>
+            <w:r>
+              <w:rPr>
+                <w:rFonts w:cs="Times New Roman"/>
+                <w:szCs w:val="26"/>
+              </w:rPr>
+              <w:t>Integrated Development Environment</w:t>
+            </w:r>
+          </w:p>
+        </w:tc>
+        <w:tc>
+          <w:tcPr>
+            <w:tcW w:w="3729" w:type="dxa"/>
+            <w:vAlign w:val="bottom"/>
+          </w:tcPr>
+          <w:p>
+            <w:pPr>
+              <w:spacing w:line="288" w:lineRule="auto"/>
+              <w:rPr>
+                <w:rFonts w:cs="Times New Roman"/>
+                <w:szCs w:val="26"/>
+              </w:rPr>
+            </w:pPr>
+            <w:r>
+              <w:rPr>
+                <w:rFonts w:cs="Times New Roman"/>
+                <w:szCs w:val="26"/>
+              </w:rPr>
+              <w:t>Môi trường phát triển tích hợp</w:t>
+            </w:r>
+          </w:p>
+        </w:tc>
+      </w:tr>
+      <w:tr>
+        <w:tc>
+          <w:tcPr>
+            <w:tcW w:w="1838" w:type="dxa"/>
+            <w:vAlign w:val="bottom"/>
+          </w:tcPr>
+          <w:p>
+            <w:pPr>
+              <w:spacing w:line="288" w:lineRule="auto"/>
+              <w:rPr>
+                <w:rFonts w:cs="Times New Roman"/>
+                <w:szCs w:val="26"/>
+              </w:rPr>
+            </w:pPr>
+            <w:r>
+              <w:rPr>
+                <w:rFonts w:cs="Times New Roman"/>
+                <w:szCs w:val="26"/>
+              </w:rPr>
+              <w:t>I/O</w:t>
+            </w:r>
+          </w:p>
+        </w:tc>
+        <w:tc>
+          <w:tcPr>
+            <w:tcW w:w="3544" w:type="dxa"/>
+            <w:vAlign w:val="bottom"/>
+          </w:tcPr>
+          <w:p>
+            <w:pPr>
+              <w:spacing w:line="288" w:lineRule="auto"/>
+              <w:rPr>
+                <w:rFonts w:cs="Times New Roman"/>
+                <w:szCs w:val="26"/>
+              </w:rPr>
+            </w:pPr>
+            <w:r>
+              <w:rPr>
+                <w:rFonts w:cs="Times New Roman"/>
+                <w:szCs w:val="26"/>
+              </w:rPr>
+              <w:t>Input/Output</w:t>
+            </w:r>
+          </w:p>
+        </w:tc>
+        <w:tc>
+          <w:tcPr>
+            <w:tcW w:w="3729" w:type="dxa"/>
+            <w:vAlign w:val="bottom"/>
+          </w:tcPr>
+          <w:p>
+            <w:pPr>
+              <w:spacing w:line="288" w:lineRule="auto"/>
+              <w:rPr>
+                <w:rFonts w:cs="Times New Roman"/>
+                <w:szCs w:val="26"/>
+              </w:rPr>
+            </w:pPr>
+            <w:r>
+              <w:rPr>
+                <w:rFonts w:cs="Times New Roman"/>
+                <w:szCs w:val="26"/>
+              </w:rPr>
+              <w:t>Nhập/Xuất dữ liệu</w:t>
+            </w:r>
+          </w:p>
+        </w:tc>
+      </w:tr>
+      <w:tr>
+        <w:tc>
+          <w:tcPr>
+            <w:tcW w:w="1838" w:type="dxa"/>
+            <w:vAlign w:val="bottom"/>
+          </w:tcPr>
+          <w:p>
+            <w:pPr>
+              <w:spacing w:line="288" w:lineRule="auto"/>
+              <w:rPr>
+                <w:rFonts w:cs="Times New Roman"/>
+                <w:szCs w:val="26"/>
+              </w:rPr>
+            </w:pPr>
+            <w:r>
+              <w:rPr>
+                <w:rFonts w:cs="Times New Roman"/>
+                <w:szCs w:val="26"/>
+              </w:rPr>
+              <w:t>RNG</w:t>
+            </w:r>
+          </w:p>
+        </w:tc>
+        <w:tc>
+          <w:tcPr>
+            <w:tcW w:w="3544" w:type="dxa"/>
+            <w:vAlign w:val="bottom"/>
+          </w:tcPr>
+          <w:p>
+            <w:pPr>
+              <w:spacing w:line="288" w:lineRule="auto"/>
+              <w:rPr>
+                <w:rFonts w:cs="Times New Roman"/>
+                <w:szCs w:val="26"/>
+              </w:rPr>
+            </w:pPr>
+            <w:r>
+              <w:rPr>
+                <w:rFonts w:cs="Times New Roman"/>
+                <w:szCs w:val="26"/>
+              </w:rPr>
+              <w:t>Random Number Generator</w:t>
+            </w:r>
+          </w:p>
+        </w:tc>
+        <w:tc>
+          <w:tcPr>
+            <w:tcW w:w="3729" w:type="dxa"/>
+            <w:vAlign w:val="bottom"/>
+          </w:tcPr>
+          <w:p>
+            <w:pPr>
+              <w:spacing w:line="288" w:lineRule="auto"/>
+              <w:rPr>
+                <w:rFonts w:cs="Times New Roman"/>
+                <w:szCs w:val="26"/>
+              </w:rPr>
+            </w:pPr>
+            <w:r>
+              <w:rPr>
+                <w:rFonts w:cs="Times New Roman"/>
+                <w:szCs w:val="26"/>
+              </w:rPr>
+              <w:t>Bộ sinh số ngẫu nhiên</w:t>
+            </w:r>
+          </w:p>
+        </w:tc>
+      </w:tr>
+      <w:tr>
+        <w:tc>
+          <w:tcPr>
+            <w:tcW w:w="1838" w:type="dxa"/>
+            <w:vAlign w:val="bottom"/>
+          </w:tcPr>
+          <w:p>
+            <w:pPr>
+              <w:spacing w:line="288" w:lineRule="auto"/>
+              <w:rPr>
+                <w:rFonts w:cs="Times New Roman"/>
+                <w:szCs w:val="26"/>
+              </w:rPr>
+            </w:pPr>
+            <w:r>
+              <w:rPr>
+                <w:rFonts w:cs="Times New Roman"/>
+                <w:szCs w:val="26"/>
+              </w:rPr>
+              <w:t>HMAC</w:t>
+            </w:r>
+          </w:p>
+        </w:tc>
+        <w:tc>
+          <w:tcPr>
+            <w:tcW w:w="3544" w:type="dxa"/>
+            <w:vAlign w:val="bottom"/>
+          </w:tcPr>
+          <w:p>
+            <w:pPr>
+              <w:spacing w:line="288" w:lineRule="auto"/>
+              <w:rPr>
+                <w:rFonts w:cs="Times New Roman"/>
+                <w:szCs w:val="26"/>
+              </w:rPr>
+            </w:pPr>
+            <w:r>
+              <w:rPr>
+                <w:rFonts w:cs="Times New Roman"/>
+                <w:szCs w:val="26"/>
+              </w:rPr>
+              <w:t>Hash-based Message Authentication Code</w:t>
+            </w:r>
+          </w:p>
+        </w:tc>
+        <w:tc>
+          <w:tcPr>
+            <w:tcW w:w="3729" w:type="dxa"/>
+            <w:vAlign w:val="bottom"/>
+          </w:tcPr>
+          <w:p>
+            <w:pPr>
+              <w:spacing w:line="288" w:lineRule="auto"/>
+              <w:rPr>
+                <w:rFonts w:cs="Times New Roman"/>
+                <w:szCs w:val="26"/>
+              </w:rPr>
+            </w:pPr>
+            <w:r>
+              <w:rPr>
+                <w:rFonts w:cs="Times New Roman"/>
+                <w:szCs w:val="26"/>
+              </w:rPr>
+              <w:t>Mã xác thực thông điệp dựa trên hàm băm</w:t>
+            </w:r>
+          </w:p>
+        </w:tc>
+      </w:tr>
+    </w:tbl>
+    <w:p>
+      <w:pPr>
         <w:spacing w:after="0" w:line="312" w:lineRule="auto"/>
       </w:pPr>
-      <w:r>
-        <w:fldChar w:fldCharType="end"/>
-      </w:r>
+    </w:p>
+    <w:p>
+      <w:pPr>
+        <w:spacing w:after="0" w:line="312" w:lineRule="auto"/>
+      </w:pPr>
       <w:r>
         <w:rPr>
           <w:b/>
@@ -20369,6 +22870,9 @@
       </w:r>
       <m:oMath>
         <m:r>
+          <m:rPr>
+            <m:sty m:val="p"/>
+          </m:rPr>
           <w:rPr>
             <w:rFonts w:ascii="Cambria Math" w:eastAsia="Courier New" w:hAnsi="Cambria Math" w:cs="Times New Roman"/>
             <w:szCs w:val="26"/>
@@ -20392,10 +22896,20 @@
           <w:rFonts w:cs="Times New Roman"/>
           <w:szCs w:val="26"/>
         </w:rPr>
-        <w:t xml:space="preserve">Ví dụ: </w:t>
+        <w:t xml:space="preserve">Ví </w:t>
+      </w:r>
+      <w:r>
+        <w:rPr>
+          <w:rFonts w:cs="Times New Roman"/>
+          <w:szCs w:val="26"/>
+        </w:rPr>
+        <w:t xml:space="preserve">dụ: </w:t>
       </w:r>
       <m:oMath>
         <m:r>
+          <m:rPr>
+            <m:sty m:val="p"/>
+          </m:rPr>
           <w:rPr>
             <w:rFonts w:ascii="Cambria Math" w:eastAsia="Courier New" w:hAnsi="Cambria Math" w:cs="Times New Roman"/>
             <w:szCs w:val="26"/>
@@ -22688,24 +25202,6 @@
           <w:rFonts w:eastAsia="Courier New" w:cs="Times New Roman"/>
           <w:szCs w:val="26"/>
         </w:rPr>
-        <w:t xml:space="preserve"> </w:t>
-      </w:r>
-    </w:p>
-    <w:p>
-      <w:pPr>
-        <w:spacing w:after="0" w:line="312" w:lineRule="auto"/>
-        <w:ind w:left="567"/>
-        <w:jc w:val="both"/>
-        <w:rPr>
-          <w:rFonts w:cs="Times New Roman"/>
-          <w:szCs w:val="26"/>
-        </w:rPr>
-      </w:pPr>
-      <w:r>
-        <w:rPr>
-          <w:rFonts w:eastAsia="Courier New" w:cs="Times New Roman"/>
-          <w:szCs w:val="26"/>
-        </w:rPr>
         <w:t>class Program</w:t>
       </w:r>
     </w:p>
@@ -23497,6 +25993,7 @@
           </w:tcPr>
           <w:p>
             <w:pPr>
+              <w:keepNext/>
               <w:spacing w:line="312" w:lineRule="auto"/>
               <w:jc w:val="both"/>
               <w:rPr>
@@ -23517,6 +26014,84 @@
     </w:tbl>
     <w:p>
       <w:pPr>
+        <w:pStyle w:val="Caption"/>
+        <w:jc w:val="center"/>
+        <w:rPr>
+          <w:i w:val="0"/>
+          <w:color w:val="000000" w:themeColor="text1"/>
+          <w:sz w:val="24"/>
+          <w:szCs w:val="24"/>
+        </w:rPr>
+      </w:pPr>
+      <w:bookmarkStart w:id="14" w:name="_Toc232051838"/>
+      <w:r>
+        <w:rPr>
+          <w:i w:val="0"/>
+          <w:color w:val="000000" w:themeColor="text1"/>
+          <w:sz w:val="24"/>
+          <w:szCs w:val="24"/>
+        </w:rPr>
+        <w:t xml:space="preserve">Bảng </w:t>
+      </w:r>
+      <w:r>
+        <w:rPr>
+          <w:i w:val="0"/>
+          <w:color w:val="000000" w:themeColor="text1"/>
+          <w:sz w:val="24"/>
+          <w:szCs w:val="24"/>
+        </w:rPr>
+        <w:fldChar w:fldCharType="begin"/>
+      </w:r>
+      <w:r>
+        <w:rPr>
+          <w:i w:val="0"/>
+          <w:color w:val="000000" w:themeColor="text1"/>
+          <w:sz w:val="24"/>
+          <w:szCs w:val="24"/>
+        </w:rPr>
+        <w:instrText xml:space="preserve"> SEQ Bảng \* ARABIC </w:instrText>
+      </w:r>
+      <w:r>
+        <w:rPr>
+          <w:i w:val="0"/>
+          <w:color w:val="000000" w:themeColor="text1"/>
+          <w:sz w:val="24"/>
+          <w:szCs w:val="24"/>
+        </w:rPr>
+        <w:fldChar w:fldCharType="separate"/>
+      </w:r>
+      <w:r>
+        <w:rPr>
+          <w:i w:val="0"/>
+          <w:noProof/>
+          <w:color w:val="000000" w:themeColor="text1"/>
+          <w:sz w:val="24"/>
+          <w:szCs w:val="24"/>
+        </w:rPr>
+        <w:t>1</w:t>
+      </w:r>
+      <w:r>
+        <w:rPr>
+          <w:i w:val="0"/>
+          <w:color w:val="000000" w:themeColor="text1"/>
+          <w:sz w:val="24"/>
+          <w:szCs w:val="24"/>
+        </w:rPr>
+        <w:fldChar w:fldCharType="end"/>
+      </w:r>
+      <w:r>
+        <w:rPr>
+          <w:i w:val="0"/>
+          <w:color w:val="000000" w:themeColor="text1"/>
+          <w:sz w:val="24"/>
+          <w:szCs w:val="24"/>
+        </w:rPr>
+        <w:t>.1. So sánh Java và C# trong triển khai mật mã</w:t>
+      </w:r>
+      <w:bookmarkEnd w:id="14"/>
+    </w:p>
+    <w:p>
+      <w:pPr>
         <w:spacing w:after="0" w:line="312" w:lineRule="auto"/>
         <w:ind w:firstLine="567"/>
         <w:jc w:val="both"/>
@@ -23543,7 +26118,7 @@
           <w:szCs w:val="26"/>
         </w:rPr>
       </w:pPr>
-      <w:bookmarkStart w:id="14" w:name="_Toc231896339"/>
+      <w:bookmarkStart w:id="15" w:name="_Toc231896339"/>
       <w:r>
         <w:rPr>
           <w:rFonts w:cs="Times New Roman"/>
@@ -23551,7 +26126,7 @@
         </w:rPr>
         <w:t>1.2.6. Lưu ý khi lập trình mật mã</w:t>
       </w:r>
-      <w:bookmarkEnd w:id="14"/>
+      <w:bookmarkEnd w:id="15"/>
     </w:p>
     <w:p>
       <w:pPr>
@@ -23695,7 +26270,7 @@
           <w:szCs w:val="26"/>
         </w:rPr>
       </w:pPr>
-      <w:bookmarkStart w:id="15" w:name="_Toc231896340"/>
+      <w:bookmarkStart w:id="16" w:name="_Toc231896340"/>
       <w:r>
         <w:rPr>
           <w:rFonts w:eastAsia="Times New Roman" w:cs="Times New Roman"/>
@@ -23703,7 +26278,7 @@
         </w:rPr>
         <w:t>1.2.7. Kết luận</w:t>
       </w:r>
-      <w:bookmarkEnd w:id="15"/>
+      <w:bookmarkEnd w:id="16"/>
     </w:p>
     <w:p>
       <w:pPr>
@@ -23754,7 +26329,7 @@
           <w:rFonts w:cs="Times New Roman"/>
           <w:szCs w:val="26"/>
         </w:rPr>
-        <w:t xml:space="preserve">Bên cạnh đó, hàm băm đóng vai trò tạo dấu vân tay số cho dữ liệu, hỗ trợ kiểm tra tính toàn vẹn, xác thực và chữ ký số. Java và C# là hai ngôn ngữ phù hợp để học tập và triển khai các thuật toán mật mã nhờ khả năng xử lý số lớn và hệ thống thư viện bảo mật </w:t>
+        <w:t xml:space="preserve">Bên cạnh đó, hàm băm đóng vai trò tạo dấu vân tay số cho dữ liệu, hỗ trợ kiểm tra tính toàn vẹn, xác thực và chữ ký số. Java và C# là hai ngôn ngữ phù hợp để học tập và </w:t>
       </w:r>
       <w:r>
         <w:rPr>
@@ -23762,7 +26337,7 @@
           <w:szCs w:val="26"/>
         </w:rPr>
         <w:lastRenderedPageBreak/>
-        <w:t>phong phú. Việc nắm vững các kiến thức này sẽ giúp người học hiểu sâu hơn về cơ chế hoạt động của các hệ thống bảo mật và có khả năng xây dựng các ứng dụng an toàn hơn trong thực tế</w:t>
+        <w:t>triển khai các thuật toán mật mã nhờ khả năng xử lý số lớn và hệ thống thư viện bảo mật phong phú. Việc nắm vững các kiến thức này sẽ giúp người học hiểu sâu hơn về cơ chế hoạt động của các hệ thống bảo mật và có khả năng xây dựng các ứng dụng an toàn hơn trong thực tế</w:t>
       </w:r>
       <w:r>
         <w:rPr>
@@ -23778,11 +26353,11 @@
         <w:spacing w:before="0" w:after="0" w:line="312" w:lineRule="auto"/>
         <w:jc w:val="both"/>
       </w:pPr>
-      <w:bookmarkStart w:id="16" w:name="_Toc231896341"/>
+      <w:bookmarkStart w:id="17" w:name="_Toc231896341"/>
       <w:r>
         <w:t>1.3. Nội dung nghiên cứu</w:t>
       </w:r>
-      <w:bookmarkEnd w:id="16"/>
+      <w:bookmarkEnd w:id="17"/>
       <w:r>
         <w:t xml:space="preserve"> </w:t>
       </w:r>
@@ -23793,11 +26368,11 @@
         <w:spacing w:before="0" w:after="0" w:line="312" w:lineRule="auto"/>
         <w:jc w:val="both"/>
       </w:pPr>
-      <w:bookmarkStart w:id="17" w:name="_Toc231896342"/>
+      <w:bookmarkStart w:id="18" w:name="_Toc231896342"/>
       <w:r>
         <w:t>1.3.1. Lý do chọn đề tài</w:t>
       </w:r>
-      <w:bookmarkEnd w:id="17"/>
+      <w:bookmarkEnd w:id="18"/>
     </w:p>
     <w:p>
       <w:pPr>
@@ -23925,11 +26500,11 @@
         <w:spacing w:before="0" w:after="0" w:line="312" w:lineRule="auto"/>
         <w:jc w:val="both"/>
       </w:pPr>
-      <w:bookmarkStart w:id="18" w:name="_Toc231896343"/>
+      <w:bookmarkStart w:id="19" w:name="_Toc231896343"/>
       <w:r>
         <w:t>1.3.2. Nội dung nghiên cứu</w:t>
       </w:r>
-      <w:bookmarkEnd w:id="18"/>
+      <w:bookmarkEnd w:id="19"/>
     </w:p>
     <w:p>
       <w:pPr>
@@ -23968,7 +26543,7 @@
           <w:sz w:val="26"/>
           <w:szCs w:val="26"/>
         </w:rPr>
-        <w:t xml:space="preserve">Tổng quan về mã hóa khóa công khai và chữ ký số Phần này tập trung làm rõ khái niệm, nguyên lý hoạt động và kiến trúc của hệ mật mã khóa bất đối xứng. Nghiên cứu cũng tiến hành rà soát các phương pháp mật mã phổ biến hiện nay (như RSA, ElGamal, </w:t>
+        <w:t xml:space="preserve">Tổng quan về mã hóa khóa công khai và chữ ký số Phần này tập trung làm rõ khái niệm, nguyên lý hoạt động và kiến trúc của hệ mật mã khóa bất đối xứng. Nghiên cứu </w:t>
       </w:r>
       <w:r>
         <w:rPr>
@@ -23977,7 +26552,7 @@
           <w:szCs w:val="26"/>
         </w:rPr>
         <w:lastRenderedPageBreak/>
-        <w:t>ECC) nhằm định vị vai trò của chữ ký số trong việc đảm bảo tính xác thực và tính chống từ chối của thông tin trong các hạ tầng mạng.</w:t>
+        <w:t>cũng tiến hành rà soát các phương pháp mật mã phổ biến hiện nay (như RSA, ElGamal, ECC) nhằm định vị vai trò của chữ ký số trong việc đảm bảo tính xác thực và tính chống từ chối của thông tin trong các hạ tầng mạng.</w:t>
       </w:r>
     </w:p>
     <w:p>
@@ -24057,15 +26632,33 @@
     </w:p>
     <w:p>
       <w:pPr>
+        <w:rPr>
+          <w:rFonts w:eastAsiaTheme="majorEastAsia" w:cstheme="majorBidi"/>
+          <w:b/>
+          <w:color w:val="000000" w:themeColor="text1"/>
+          <w:sz w:val="32"/>
+          <w:szCs w:val="32"/>
+          <w:highlight w:val="lightGray"/>
+        </w:rPr>
+      </w:pPr>
+      <w:bookmarkStart w:id="20" w:name="_Toc231896344"/>
+      <w:r>
+        <w:rPr>
+          <w:highlight w:val="lightGray"/>
+        </w:rPr>
+        <w:br w:type="page"/>
+      </w:r>
+    </w:p>
+    <w:p>
+      <w:pPr>
         <w:pStyle w:val="Heading1"/>
-        <w:spacing w:before="0" w:after="0" w:line="312" w:lineRule="auto"/>
         <w:jc w:val="center"/>
       </w:pPr>
-      <w:bookmarkStart w:id="19" w:name="_Toc231896344"/>
-      <w:r>
+      <w:r>
+        <w:lastRenderedPageBreak/>
         <w:t>KẾT QUẢ NGHIÊN CỨU</w:t>
       </w:r>
-      <w:bookmarkEnd w:id="19"/>
+      <w:bookmarkEnd w:id="20"/>
     </w:p>
     <w:p>
       <w:pPr>
@@ -24073,11 +26666,11 @@
         <w:spacing w:before="0" w:after="0" w:line="312" w:lineRule="auto"/>
         <w:jc w:val="both"/>
       </w:pPr>
-      <w:bookmarkStart w:id="20" w:name="_Toc231896345"/>
+      <w:bookmarkStart w:id="21" w:name="_Toc231896345"/>
       <w:r>
         <w:t>2.1. Nghiên cứu, tìm hiểu hệ mã hóa khóa công khai.</w:t>
       </w:r>
-      <w:bookmarkEnd w:id="20"/>
+      <w:bookmarkEnd w:id="21"/>
     </w:p>
     <w:p>
       <w:pPr>
@@ -24085,11 +26678,11 @@
         <w:spacing w:before="0" w:after="0" w:line="312" w:lineRule="auto"/>
         <w:jc w:val="both"/>
       </w:pPr>
-      <w:bookmarkStart w:id="21" w:name="_Toc231896346"/>
+      <w:bookmarkStart w:id="22" w:name="_Toc231896346"/>
       <w:r>
         <w:t>2.1.1. Khái niệm và nguyên lý hoạt động của mã hóa khóa công khai.</w:t>
       </w:r>
-      <w:bookmarkEnd w:id="21"/>
+      <w:bookmarkEnd w:id="22"/>
     </w:p>
     <w:p>
       <w:pPr>
@@ -24152,7 +26745,6 @@
           <w:sz w:val="26"/>
           <w:szCs w:val="26"/>
         </w:rPr>
-        <w:lastRenderedPageBreak/>
         <w:tab/>
       </w:r>
       <w:r>
@@ -25128,7 +27720,7 @@
           <w:szCs w:val="26"/>
         </w:rPr>
       </w:pPr>
-      <w:bookmarkStart w:id="22" w:name="_Toc231896347"/>
+      <w:bookmarkStart w:id="23" w:name="_Toc231896347"/>
       <w:r>
         <w:rPr>
           <w:rFonts w:cs="Times New Roman"/>
@@ -25136,7 +27728,7 @@
         </w:rPr>
         <w:t>2.1.2. Các phương pháp mã hóa phổ biến hiện nay</w:t>
       </w:r>
-      <w:bookmarkEnd w:id="22"/>
+      <w:bookmarkEnd w:id="23"/>
     </w:p>
     <w:p>
       <w:pPr>
@@ -25316,6 +27908,7 @@
           <w:sz w:val="26"/>
           <w:szCs w:val="26"/>
         </w:rPr>
+        <w:lastRenderedPageBreak/>
         <w:t>AES (Advanced Encryption Standard): Tiêu chuẩn mã hóa hiện đại, hỗ trợ các độ dài khóa 128-bit, 192-bit và 256-bit. Hiện nay, AES-256 được coi là chuẩn mã hóa an toàn nhất, có khả năng chống lại các cuộc tấn công thám mã bằng máy tính thông thường.</w:t>
       </w:r>
     </w:p>
@@ -25358,7 +27951,6 @@
           <w:rFonts w:cs="Times New Roman"/>
           <w:szCs w:val="26"/>
         </w:rPr>
-        <w:lastRenderedPageBreak/>
         <w:t>2.1.2.2.</w:t>
       </w:r>
       <w:r>
@@ -25601,6 +28193,7 @@
           <w:sz w:val="26"/>
           <w:szCs w:val="26"/>
         </w:rPr>
+        <w:lastRenderedPageBreak/>
         <w:t>Đặc tính kĩ thuật: Tính toán một chiều (không thể suy ngược từ chuỗi băm ra dữ liệu gốc) và tính chống xung đột (hai dữ liệu khác nhau cực kỳ khó tạo ra cùng một chuỗi băm).</w:t>
       </w:r>
     </w:p>
@@ -25669,7 +28262,6 @@
           <w:sz w:val="26"/>
           <w:szCs w:val="26"/>
         </w:rPr>
-        <w:lastRenderedPageBreak/>
         <w:t>SHA-2 (SHA-256, SHA-512): Tiêu chuẩn hàm băm phổ biến và an toàn nhất hiện nay, ứng dụng rộng rãi trong các chứng chỉ số SSL/TLS và hệ thống bảo mật.</w:t>
       </w:r>
     </w:p>
@@ -25724,20 +28316,19 @@
     </w:p>
     <w:p>
       <w:pPr>
-        <w:pStyle w:val="NormalWeb"/>
-        <w:spacing w:before="0" w:beforeAutospacing="0" w:after="0" w:afterAutospacing="0" w:line="312" w:lineRule="auto"/>
-        <w:ind w:firstLine="360"/>
-        <w:jc w:val="both"/>
-        <w:rPr>
-          <w:sz w:val="26"/>
-          <w:szCs w:val="26"/>
-        </w:rPr>
-      </w:pPr>
-      <w:r>
-        <w:rPr>
-          <w:color w:val="000000"/>
-          <w:sz w:val="26"/>
-          <w:szCs w:val="26"/>
+        <w:spacing w:after="0" w:line="312" w:lineRule="auto"/>
+        <w:rPr>
+          <w:sz w:val="28"/>
+          <w:szCs w:val="28"/>
+        </w:rPr>
+      </w:pPr>
+      <w:r>
+        <w:tab/>
+      </w:r>
+      <w:r>
+        <w:rPr>
+          <w:sz w:val="28"/>
+          <w:szCs w:val="28"/>
         </w:rPr>
         <w:t>Trong các kiến trúc hệ thống thực tế (như giao thức HTTPS, SSL/TLS, SSH), để tối ưu hóa giữa tính an toàn của mã hóa bất đối xứng và tốc độ của mã hóa đối xứng, giải pháp mã hóa lai được áp dụng theo quy trình hai bước:</w:t>
       </w:r>
@@ -25800,7 +28391,7 @@
           <w:szCs w:val="26"/>
         </w:rPr>
       </w:pPr>
-      <w:bookmarkStart w:id="23" w:name="_Toc231896348"/>
+      <w:bookmarkStart w:id="24" w:name="_Toc231896348"/>
       <w:r>
         <w:rPr>
           <w:rFonts w:cs="Times New Roman"/>
@@ -25808,7 +28399,7 @@
         </w:rPr>
         <w:t>2.1.3. Vai trò của mã hóa khóa công khai trong xác thực và chữ ký số.</w:t>
       </w:r>
-      <w:bookmarkEnd w:id="23"/>
+      <w:bookmarkEnd w:id="24"/>
     </w:p>
     <w:p>
       <w:pPr>
@@ -25820,6 +28411,14 @@
           <w:szCs w:val="26"/>
         </w:rPr>
       </w:pPr>
+      <w:r>
+        <w:rPr>
+          <w:color w:val="000000"/>
+          <w:sz w:val="26"/>
+          <w:szCs w:val="26"/>
+        </w:rPr>
+        <w:tab/>
+      </w:r>
       <w:r>
         <w:rPr>
           <w:color w:val="000000"/>
@@ -25993,49 +28592,27 @@
         <w:pStyle w:val="Heading2"/>
         <w:spacing w:before="0" w:after="0" w:line="312" w:lineRule="auto"/>
       </w:pPr>
-      <w:bookmarkStart w:id="24" w:name="_Toc231896349"/>
+      <w:bookmarkStart w:id="25" w:name="_Toc231896349"/>
       <w:r>
         <w:t>2.2. Nghiên cứu, tìm hiểu về Chữ ký số Elgamal</w:t>
       </w:r>
-      <w:bookmarkEnd w:id="24"/>
+      <w:bookmarkEnd w:id="25"/>
     </w:p>
     <w:p>
       <w:pPr>
         <w:pStyle w:val="Heading3"/>
-        <w:spacing w:before="0" w:after="0" w:line="312" w:lineRule="auto"/>
-        <w:jc w:val="both"/>
-        <w:rPr>
-          <w:rFonts w:cs="Times New Roman"/>
-          <w:b w:val="0"/>
-          <w:szCs w:val="26"/>
-        </w:rPr>
-      </w:pPr>
-      <w:bookmarkStart w:id="25" w:name="_Toc231896350"/>
-      <w:r>
-        <w:rPr>
-          <w:rFonts w:cs="Times New Roman"/>
-          <w:b w:val="0"/>
-          <w:szCs w:val="26"/>
-        </w:rPr>
+      </w:pPr>
+      <w:bookmarkStart w:id="26" w:name="_Toc231896350"/>
+      <w:r>
         <w:t>2.2.1. Cấu trúc và nguyên lý hoạt động của thuậ</w:t>
       </w:r>
       <w:r>
-        <w:rPr>
-          <w:rFonts w:cs="Times New Roman"/>
-          <w:b w:val="0"/>
-          <w:szCs w:val="26"/>
-        </w:rPr>
         <w:t>t toán Elgamal</w:t>
       </w:r>
       <w:r>
-        <w:rPr>
-          <w:rFonts w:cs="Times New Roman"/>
-          <w:b w:val="0"/>
-          <w:szCs w:val="26"/>
-        </w:rPr>
         <w:t>.</w:t>
       </w:r>
-      <w:bookmarkEnd w:id="25"/>
+      <w:bookmarkEnd w:id="26"/>
     </w:p>
     <w:p>
       <w:pPr>
@@ -26084,7 +28661,6 @@
           <w:rFonts w:cs="Times New Roman"/>
           <w:szCs w:val="26"/>
         </w:rPr>
-        <w:lastRenderedPageBreak/>
         <w:t xml:space="preserve">Bước 1: Chọn số nguyên tố: Chọn hai số nguyên tố lớn, p và q, sao cho q chia hết (p-1). Những số nguyên tố này nên được giữ bí mật. </w:t>
       </w:r>
     </w:p>
@@ -26817,6 +29393,7 @@
           <w:rFonts w:cs="Times New Roman"/>
           <w:szCs w:val="26"/>
         </w:rPr>
+        <w:lastRenderedPageBreak/>
         <w:t xml:space="preserve">Bước 2: Tính u1 và u2: Tính </w:t>
       </w:r>
       <m:oMath>
@@ -27322,24 +29899,12 @@
     <w:p>
       <w:pPr>
         <w:pStyle w:val="Heading3"/>
-        <w:spacing w:before="0" w:after="0" w:line="312" w:lineRule="auto"/>
-        <w:jc w:val="both"/>
-        <w:rPr>
-          <w:rFonts w:cs="Times New Roman"/>
-          <w:b w:val="0"/>
-          <w:szCs w:val="26"/>
-        </w:rPr>
-      </w:pPr>
-      <w:bookmarkStart w:id="26" w:name="_Toc231896351"/>
-      <w:r>
-        <w:rPr>
-          <w:rFonts w:cs="Times New Roman"/>
-          <w:b w:val="0"/>
-          <w:szCs w:val="26"/>
-        </w:rPr>
+      </w:pPr>
+      <w:bookmarkStart w:id="27" w:name="_Toc231896351"/>
+      <w:r>
         <w:t>2.2.2. Ưu điểm và hạn chế của thuật toán so với các phương pháp khác.</w:t>
       </w:r>
-      <w:bookmarkEnd w:id="26"/>
+      <w:bookmarkEnd w:id="27"/>
     </w:p>
     <w:p>
       <w:pPr>
@@ -27412,7 +29977,6 @@
           <w:rFonts w:cs="Times New Roman"/>
           <w:szCs w:val="26"/>
         </w:rPr>
-        <w:lastRenderedPageBreak/>
         <w:t>Phụ thuộc vào bản rõ và giá trị ngẫu nhiên: Bản mã Elgamal phụ thuộc vào bản rõ và một giá trị ngẫu nhiên. Do đó, từ một bản rõ, ta có thể tạo ra nhiều bản mã khác nhau.</w:t>
       </w:r>
     </w:p>
@@ -27606,24 +30170,12 @@
     <w:p>
       <w:pPr>
         <w:pStyle w:val="Heading3"/>
-        <w:spacing w:before="0" w:after="0" w:line="312" w:lineRule="auto"/>
-        <w:jc w:val="both"/>
-        <w:rPr>
-          <w:rFonts w:cs="Times New Roman"/>
-          <w:b w:val="0"/>
-          <w:szCs w:val="26"/>
-        </w:rPr>
-      </w:pPr>
-      <w:bookmarkStart w:id="27" w:name="_Toc231896352"/>
-      <w:r>
-        <w:rPr>
-          <w:rFonts w:cs="Times New Roman"/>
-          <w:b w:val="0"/>
-          <w:szCs w:val="26"/>
-        </w:rPr>
+      </w:pPr>
+      <w:bookmarkStart w:id="28" w:name="_Toc231896352"/>
+      <w:r>
         <w:t>2.2.3. Các ứng dụng thực tế của Elmagal trong bảo mật dữ liệu.</w:t>
       </w:r>
-      <w:bookmarkEnd w:id="27"/>
+      <w:bookmarkEnd w:id="28"/>
     </w:p>
     <w:p>
       <w:pPr>
@@ -27713,7 +30265,16 @@
           <w:szCs w:val="26"/>
           <w:lang w:val="en-US"/>
         </w:rPr>
-        <w:t xml:space="preserve">Ứng dụng thực tế lớn nhất và có tầm ảnh hưởng sâu rộng nhất của hệ chữ ký số ElGamal chính là việc làm tiền đề kỹ thuật trực tiếp cho thuật toán DSA (Digital Signature Algorithm). DSA đã được Viện Tiêu chuẩn và Công nghệ Quốc gia Hoa Kỳ (NIST) chuẩn hóa trong văn bản FIPS 186 và trở thành một trong những chuẩn chữ ký số quốc gia được thừa nhận rộng rãi nhất trên thế giới. Bằng cách cải tiến các phương trình toán học của ElGamal nhằm thu gọn kích thước cặp chữ ký </w:t>
+        <w:t xml:space="preserve">Ứng dụng thực tế lớn nhất và có tầm ảnh hưởng sâu rộng nhất của hệ chữ ký số ElGamal chính là việc làm tiền đề kỹ thuật trực tiếp cho thuật toán DSA (Digital Signature Algorithm). DSA đã được Viện Tiêu chuẩn và Công nghệ Quốc gia Hoa Kỳ </w:t>
+      </w:r>
+      <w:r>
+        <w:rPr>
+          <w:rFonts w:cs="Times New Roman"/>
+          <w:szCs w:val="26"/>
+          <w:lang w:val="en-US"/>
+        </w:rPr>
+        <w:lastRenderedPageBreak/>
+        <w:t xml:space="preserve">(NIST) chuẩn hóa trong văn bản FIPS 186 và trở thành một trong những chuẩn chữ ký số quốc gia được thừa nhận rộng rãi nhất trên thế giới. Bằng cách cải tiến các phương trình toán học của ElGamal nhằm thu gọn kích thước cặp chữ ký </w:t>
       </w:r>
       <w:r>
         <w:rPr>
@@ -27777,16 +30338,7 @@
           <w:szCs w:val="26"/>
           <w:lang w:val="en-US"/>
         </w:rPr>
-        <w:t xml:space="preserve">Nhờ đặc tính ngẫu nhiên hóa bản mã và chữ ký (Randomized Scheme) – nghĩa là cùng một dữ liệu đầu vào nhưng mỗi lần ký với một tham số $k$ ngẫu nhiên khác nhau sẽ tạo ra các cặp chữ ký hoàn toàn khác biệt – ElGamal là lựa chọn ưu tiên hàng đầu </w:t>
-      </w:r>
-      <w:r>
-        <w:rPr>
-          <w:rFonts w:cs="Times New Roman"/>
-          <w:szCs w:val="26"/>
-          <w:lang w:val="en-US"/>
-        </w:rPr>
-        <w:lastRenderedPageBreak/>
-        <w:t>trong các hệ thống bỏ phiếu điện tử bảo mật chuyên dụng. Thuật toán cho phép người bỏ phiếu ký số lên lá phiếu của mình để chứng minh tính hợp lệ của quyền bầu cử mà vẫn đảm bảo tính ẩn danh tuyệt đối. Tác nhân giám sát bên ngoài hoặc các cuộc tấn công thu thập dữ liệu không thể liên kết cấu trúc toán học của chữ ký để suy diễn ra danh tính của cử tri, giải quyết triệt để bài toán minh bạch và bảo mật thông tin trong chính trị số.</w:t>
+        <w:t>Nhờ đặc tính ngẫu nhiên hóa bản mã và chữ ký (Randomized Scheme) – nghĩa là cùng một dữ liệu đầu vào nhưng mỗi lần ký với một tham số $k$ ngẫu nhiên khác nhau sẽ tạo ra các cặp chữ ký hoàn toàn khác biệt – ElGamal là lựa chọn ưu tiên hàng đầu trong các hệ thống bỏ phiếu điện tử bảo mật chuyên dụng. Thuật toán cho phép người bỏ phiếu ký số lên lá phiếu của mình để chứng minh tính hợp lệ của quyền bầu cử mà vẫn đảm bảo tính ẩn danh tuyệt đối. Tác nhân giám sát bên ngoài hoặc các cuộc tấn công thu thập dữ liệu không thể liên kết cấu trúc toán học của chữ ký để suy diễn ra danh tính của cử tri, giải quyết triệt để bài toán minh bạch và bảo mật thông tin trong chính trị số.</w:t>
       </w:r>
     </w:p>
     <w:p>
@@ -27909,7 +30461,16 @@
           <w:szCs w:val="26"/>
           <w:lang w:val="en-US"/>
         </w:rPr>
-        <w:t>Trong xu hướng chuyển dịch công nghệ an ninh mạng sang các thiết bị có tài nguyên phần cứng hạn chế như thẻ thông minh (Smart Card), thiết bị di động hay hệ thống nhúng IoT, toán học ElGamal đã được ánh xạ thành công lên cấu trúc hình học của đường cong Elliptic, tạo nên hệ chữ ký số ECDSA và hệ mật mã tương đương. Việc ứng dụng nguyên lý logarit rời rạc của ElGamal trên nhóm các điểm thuộc đường cong Elliptic giúp hệ thống đạt được cấp độ bảo mật tương đương với RSA hay ElGamal truyền thống nhưng với kích thước chiều dài khóa ngắn hơn rất nhiều, làm giảm áp lực lưu trữ bộ nhớ và băng thông truyền tải mạng cho các thiết bị công nghệ hiện nay.</w:t>
+        <w:t xml:space="preserve">Trong xu hướng chuyển dịch công nghệ an ninh mạng sang các thiết bị có tài nguyên phần cứng hạn chế như thẻ thông minh (Smart Card), thiết bị di động hay hệ thống nhúng IoT, toán học ElGamal đã được ánh xạ thành công lên cấu trúc hình học của đường cong Elliptic, tạo nên hệ chữ ký số ECDSA và hệ mật mã tương đương. Việc ứng dụng nguyên lý logarit rời rạc của ElGamal trên nhóm các điểm thuộc đường cong Elliptic giúp hệ thống đạt được cấp độ bảo mật tương đương với RSA hay ElGamal </w:t>
+      </w:r>
+      <w:r>
+        <w:rPr>
+          <w:rFonts w:cs="Times New Roman"/>
+          <w:szCs w:val="26"/>
+          <w:lang w:val="en-US"/>
+        </w:rPr>
+        <w:lastRenderedPageBreak/>
+        <w:t>truyền thống nhưng với kích thước chiều dài khóa ngắn hơn rất nhiều, làm giảm áp lực lưu trữ bộ nhớ và băng thông truyền tải mạng cho các thiết bị công nghệ hiện nay.</w:t>
       </w:r>
     </w:p>
     <w:p>
@@ -27917,22 +30478,22 @@
         <w:pStyle w:val="Heading2"/>
         <w:spacing w:before="0" w:after="0" w:line="312" w:lineRule="auto"/>
       </w:pPr>
-      <w:bookmarkStart w:id="28" w:name="_Toc231896353"/>
+      <w:bookmarkStart w:id="29" w:name="_Toc231896353"/>
       <w:r>
         <w:t>2.3. Thiết kế chương trình, cài đặt thuật toán.</w:t>
       </w:r>
-      <w:bookmarkEnd w:id="28"/>
+      <w:bookmarkEnd w:id="29"/>
     </w:p>
     <w:p>
       <w:pPr>
         <w:pStyle w:val="Heading3"/>
         <w:spacing w:before="0" w:after="0" w:line="312" w:lineRule="auto"/>
       </w:pPr>
-      <w:bookmarkStart w:id="29" w:name="_Toc231896354"/>
+      <w:bookmarkStart w:id="30" w:name="_Toc231896354"/>
       <w:r>
         <w:t>2.3.1. Thiết kế kịch bản chương trình</w:t>
       </w:r>
-      <w:bookmarkEnd w:id="29"/>
+      <w:bookmarkEnd w:id="30"/>
     </w:p>
     <w:p>
       <w:pPr>
@@ -28059,7 +30620,6 @@
           <w:rFonts w:cs="Times New Roman"/>
           <w:szCs w:val="26"/>
         </w:rPr>
-        <w:lastRenderedPageBreak/>
         <w:tab/>
         <w:t xml:space="preserve">Bước 3: Chọn một số nguyên ngẫu nhiên x làm Khóa bí mật, điều kiện       </w:t>
       </w:r>
@@ -28767,6 +31327,7 @@
           <w:rFonts w:cs="Times New Roman"/>
           <w:szCs w:val="26"/>
         </w:rPr>
+        <w:lastRenderedPageBreak/>
         <w:tab/>
       </w:r>
       <w:r>
@@ -29139,11 +31700,11 @@
         <w:pStyle w:val="Heading3"/>
         <w:spacing w:before="0" w:after="0" w:line="312" w:lineRule="auto"/>
       </w:pPr>
-      <w:bookmarkStart w:id="30" w:name="_Toc231896355"/>
+      <w:bookmarkStart w:id="31" w:name="_Toc231896355"/>
       <w:r>
         <w:t>2.3.2. Giới thiệu ngôn ngữ lập trình sử dụng để cài đặt thuật toán.</w:t>
       </w:r>
-      <w:bookmarkEnd w:id="30"/>
+      <w:bookmarkEnd w:id="31"/>
       <w:r>
         <w:t xml:space="preserve"> </w:t>
       </w:r>
@@ -29172,15 +31733,7 @@
           <w:rFonts w:cs="Times New Roman"/>
           <w:szCs w:val="26"/>
         </w:rPr>
-        <w:t xml:space="preserve">C# (C-Sharp) là một ngôn ngữ lập trình được phát triển vào khoảng năm 2000 bởi Anders Hejlsberg và đội ngũ kỹ sư tại tập đoàn Microsoft. Đây là một ngôn ngữ lập trình </w:t>
-      </w:r>
-      <w:r>
-        <w:rPr>
-          <w:rFonts w:cs="Times New Roman"/>
-          <w:szCs w:val="26"/>
-        </w:rPr>
-        <w:lastRenderedPageBreak/>
-        <w:t>hiện đại, hướng đối tượng, an toàn kiểu (type-safe) và có nguồn gốc chặt chẽ từ họ ngôn ngữ C (như C, C++, Java). Ngôn ngữ lập trình này có thể chạy trên nhiều nền tảng khác nhau như: Windows, macOS và Linux thông qua nền tảng .NET. Từ khi ra mắt, C# đã nhanh chóng trở thành một trong những ngôn ngữ thương mại được ưa thích của các lập trình viên trên toàn thế giới. Theo thời gian, nó đã mở rộng đáng kể và hiện nay có nhiều tính năng như: lập trình hướng đối tượng, lập trình chức năng, lập trình không đồng bộ,</w:t>
+        <w:t>C# (C-Sharp) là một ngôn ngữ lập trình được phát triển vào khoảng năm 2000 bởi Anders Hejlsberg và đội ngũ kỹ sư tại tập đoàn Microsoft. Đây là một ngôn ngữ lập trình hiện đại, hướng đối tượng, an toàn kiểu (type-safe) và có nguồn gốc chặt chẽ từ họ ngôn ngữ C (như C, C++, Java). Ngôn ngữ lập trình này có thể chạy trên nhiều nền tảng khác nhau như: Windows, macOS và Linux thông qua nền tảng .NET. Từ khi ra mắt, C# đã nhanh chóng trở thành một trong những ngôn ngữ thương mại được ưa thích của các lập trình viên trên toàn thế giới. Theo thời gian, nó đã mở rộng đáng kể và hiện nay có nhiều tính năng như: lập trình hướng đối tượng, lập trình chức năng, lập trình không đồng bộ,</w:t>
       </w:r>
       <w:r>
         <w:rPr>
@@ -29380,6 +31933,7 @@
           <w:rFonts w:cs="Times New Roman"/>
           <w:szCs w:val="26"/>
         </w:rPr>
+        <w:lastRenderedPageBreak/>
         <w:t>Có nhiều công cụ, phần mềm và IDE hỗ trợ (đặc biệt là Microsoft Visual Studio) giúp bạn đơn giản hóa công việc.</w:t>
       </w:r>
     </w:p>
@@ -29488,15 +32042,7 @@
           <w:rFonts w:cs="Times New Roman"/>
           <w:szCs w:val="26"/>
         </w:rPr>
-        <w:t xml:space="preserve">Hỗ trợ tạo giao diện một cách dễ dàng: Sử dụng nền tảng WPF (Windows Presentation Foundation) giúp tách biệt hoàn toàn code xử lý thuật toán và giao </w:t>
-      </w:r>
-      <w:r>
-        <w:rPr>
-          <w:rFonts w:cs="Times New Roman"/>
-          <w:szCs w:val="26"/>
-        </w:rPr>
-        <w:lastRenderedPageBreak/>
-        <w:t>diện. Cơ chế Data Binding linh hoạt giúp hiển thị kết quả thuật toán lên giao diện nhanh chóng, mượt mà và trực quan.</w:t>
+        <w:t>Hỗ trợ tạo giao diện một cách dễ dàng: Sử dụng nền tảng WPF (Windows Presentation Foundation) giúp tách biệt hoàn toàn code xử lý thuật toán và giao diện. Cơ chế Data Binding linh hoạt giúp hiển thị kết quả thuật toán lên giao diện nhanh chóng, mượt mà và trực quan.</w:t>
       </w:r>
     </w:p>
     <w:p>
@@ -29831,7 +32377,16 @@
           <w:szCs w:val="26"/>
           <w:lang w:val="en-US"/>
         </w:rPr>
-        <w:t>.SecureRandom. Đây là bộ sinh số ngẫu nhiên an toàn về mặt mật mã học (Cryptographically Strong Pseudo-Random Number Generator), chịu trách nhiệm sinh ra khóa bí mật x và tham số ngẫu nhiên k mà không tuân theo các quy luật tuần hoàn thông thường, nâng cao tối đa chỉ số bảo mật cho toàn bộ hệ thống.</w:t>
+        <w:t xml:space="preserve">.SecureRandom. Đây là bộ sinh số ngẫu nhiên an toàn về mặt mật mã học </w:t>
+      </w:r>
+      <w:r>
+        <w:rPr>
+          <w:rFonts w:eastAsia="Times New Roman" w:cs="Times New Roman"/>
+          <w:szCs w:val="26"/>
+          <w:lang w:val="en-US"/>
+        </w:rPr>
+        <w:lastRenderedPageBreak/>
+        <w:t>(Cryptographically Strong Pseudo-Random Number Generator), chịu trách nhiệm sinh ra khóa bí mật x và tham số ngẫu nhiên k mà không tuân theo các quy luật tuần hoàn thông thường, nâng cao tối đa chỉ số bảo mật cho toàn bộ hệ thống.</w:t>
       </w:r>
     </w:p>
     <w:p>
@@ -29917,16 +32472,7 @@
           <w:szCs w:val="26"/>
           <w:lang w:val="en-US"/>
         </w:rPr>
-        <w:t xml:space="preserve">.MessageDigest, cho phép tích hợp trực tiếp thuật toán băm mật mã học SHA-256 tiêu chuẩn. Thuật toán SHA-256 sẽ </w:t>
-      </w:r>
-      <w:r>
-        <w:rPr>
-          <w:rFonts w:eastAsia="Times New Roman" w:cs="Times New Roman"/>
-          <w:szCs w:val="26"/>
-          <w:lang w:val="en-US"/>
-        </w:rPr>
-        <w:lastRenderedPageBreak/>
-        <w:t>chuyển đổi bất kỳ tệp tin văn phòng nào thành một chuỗi đại diện hình vân tay số cố định có độ dài 256 bit trước khi đưa vào module ký.</w:t>
+        <w:t>.MessageDigest, cho phép tích hợp trực tiếp thuật toán băm mật mã học SHA-256 tiêu chuẩn. Thuật toán SHA-256 sẽ chuyển đổi bất kỳ tệp tin văn phòng nào thành một chuỗi đại diện hình vân tay số cố định có độ dài 256 bit trước khi đưa vào module ký.</w:t>
       </w:r>
     </w:p>
     <w:p>
@@ -30038,11 +32584,11 @@
         <w:pStyle w:val="Heading3"/>
         <w:spacing w:before="0" w:after="0" w:line="312" w:lineRule="auto"/>
       </w:pPr>
-      <w:bookmarkStart w:id="31" w:name="_Toc231896356"/>
+      <w:bookmarkStart w:id="32" w:name="_Toc231896356"/>
       <w:r>
         <w:t>2.3.3. Cài đặt thuật toán, giao diện chương trình</w:t>
       </w:r>
-      <w:bookmarkEnd w:id="31"/>
+      <w:bookmarkEnd w:id="32"/>
       <w:r>
         <w:t xml:space="preserve"> </w:t>
       </w:r>
@@ -30164,6 +32710,7 @@
           <w:rFonts w:cs="Times New Roman"/>
           <w:szCs w:val="26"/>
         </w:rPr>
+        <w:lastRenderedPageBreak/>
         <w:t xml:space="preserve">Thư viện mã hóa </w:t>
       </w:r>
       <w:proofErr w:type="gramStart"/>
@@ -30361,7 +32908,6 @@
           <w:szCs w:val="26"/>
           <w:highlight w:val="white"/>
         </w:rPr>
-        <w:lastRenderedPageBreak/>
         <w:t xml:space="preserve">    BigInteger result = a % m;</w:t>
       </w:r>
     </w:p>
@@ -30908,6 +33454,7 @@
           <w:rFonts w:cs="Times New Roman"/>
           <w:szCs w:val="26"/>
         </w:rPr>
+        <w:lastRenderedPageBreak/>
         <w:t>Hàm kiểm tra số nguyên tố Miller-Rabin:</w:t>
       </w:r>
     </w:p>
@@ -31200,7 +33747,6 @@
           <w:szCs w:val="26"/>
           <w:highlight w:val="white"/>
         </w:rPr>
-        <w:lastRenderedPageBreak/>
         <w:t xml:space="preserve">        p |= (BigInteger.One &lt;&lt; (bits - 2));</w:t>
       </w:r>
     </w:p>
@@ -31811,6 +34357,7 @@
           <w:szCs w:val="26"/>
           <w:highlight w:val="white"/>
         </w:rPr>
+        <w:lastRenderedPageBreak/>
         <w:t xml:space="preserve">        </w:t>
       </w:r>
       <w:proofErr w:type="gramStart"/>
@@ -32084,7 +34631,6 @@
           <w:szCs w:val="26"/>
           <w:highlight w:val="white"/>
         </w:rPr>
-        <w:lastRenderedPageBreak/>
         <w:t xml:space="preserve">    BigInteger p = GenerateProbablePrime(bits);</w:t>
       </w:r>
     </w:p>
@@ -32699,6 +35245,7 @@
           <w:szCs w:val="26"/>
           <w:highlight w:val="white"/>
         </w:rPr>
+        <w:lastRenderedPageBreak/>
         <w:t xml:space="preserve">public bool </w:t>
       </w:r>
       <w:proofErr w:type="gramStart"/>
@@ -32936,7 +35483,6 @@
           <w:szCs w:val="28"/>
           <w:lang w:val="en-US"/>
         </w:rPr>
-        <w:lastRenderedPageBreak/>
         <w:drawing>
           <wp:inline distT="114300" distB="114300" distL="114300" distR="114300" wp14:anchorId="6920517B" wp14:editId="17E2C7A8">
             <wp:extent cx="5791835" cy="4064000"/>
@@ -32990,7 +35536,7 @@
           <w:szCs w:val="24"/>
         </w:rPr>
       </w:pPr>
-      <w:bookmarkStart w:id="32" w:name="_Toc231896207"/>
+      <w:bookmarkStart w:id="33" w:name="_Toc231896207"/>
       <w:r>
         <w:rPr>
           <w:i w:val="0"/>
@@ -33110,7 +35656,7 @@
         </w:rPr>
         <w:t>. Giao diện chương trình C#</w:t>
       </w:r>
-      <w:bookmarkEnd w:id="32"/>
+      <w:bookmarkEnd w:id="33"/>
     </w:p>
     <w:p>
       <w:pPr>
@@ -33186,6 +35732,7 @@
           <w:sz w:val="28"/>
           <w:szCs w:val="28"/>
         </w:rPr>
+        <w:lastRenderedPageBreak/>
         <w:t xml:space="preserve"> </w:t>
       </w:r>
     </w:p>
@@ -33200,7 +35747,6 @@
           <w:sz w:val="28"/>
           <w:szCs w:val="28"/>
         </w:rPr>
-        <w:lastRenderedPageBreak/>
         <w:t xml:space="preserve"> </w:t>
       </w:r>
       <w:r>
@@ -33263,7 +35809,7 @@
           <w:szCs w:val="24"/>
         </w:rPr>
       </w:pPr>
-      <w:bookmarkStart w:id="33" w:name="_Toc231896208"/>
+      <w:bookmarkStart w:id="34" w:name="_Toc231896208"/>
       <w:r>
         <w:rPr>
           <w:i w:val="0"/>
@@ -33383,7 +35929,7 @@
         </w:rPr>
         <w:t>. Tạo khóa(C#)</w:t>
       </w:r>
-      <w:bookmarkEnd w:id="33"/>
+      <w:bookmarkEnd w:id="34"/>
     </w:p>
     <w:p>
       <w:pPr>
@@ -33495,7 +36041,7 @@
           <w:szCs w:val="24"/>
         </w:rPr>
       </w:pPr>
-      <w:bookmarkStart w:id="34" w:name="_Toc231896209"/>
+      <w:bookmarkStart w:id="35" w:name="_Toc231896209"/>
       <w:r>
         <w:rPr>
           <w:i w:val="0"/>
@@ -33615,7 +36161,7 @@
         </w:rPr>
         <w:t>. Ký văn bản(C#)</w:t>
       </w:r>
-      <w:bookmarkEnd w:id="34"/>
+      <w:bookmarkEnd w:id="35"/>
     </w:p>
     <w:p>
       <w:pPr>
@@ -33683,7 +36229,7 @@
           <w:szCs w:val="24"/>
         </w:rPr>
       </w:pPr>
-      <w:bookmarkStart w:id="35" w:name="_Toc231896210"/>
+      <w:bookmarkStart w:id="36" w:name="_Toc231896210"/>
       <w:r>
         <w:rPr>
           <w:i w:val="0"/>
@@ -33803,7 +36349,7 @@
         </w:rPr>
         <w:t>. Ký văn bản (C#)</w:t>
       </w:r>
-      <w:bookmarkEnd w:id="35"/>
+      <w:bookmarkEnd w:id="36"/>
     </w:p>
     <w:p>
       <w:pPr>
@@ -33921,7 +36467,7 @@
           <w:szCs w:val="24"/>
         </w:rPr>
       </w:pPr>
-      <w:bookmarkStart w:id="36" w:name="_Toc231896211"/>
+      <w:bookmarkStart w:id="37" w:name="_Toc231896211"/>
       <w:r>
         <w:rPr>
           <w:i w:val="0"/>
@@ -34041,7 +36587,7 @@
         </w:rPr>
         <w:t>. Xác thực chữ ký(C#)</w:t>
       </w:r>
-      <w:bookmarkEnd w:id="36"/>
+      <w:bookmarkEnd w:id="37"/>
     </w:p>
     <w:p>
       <w:pPr>
@@ -34151,7 +36697,7 @@
           <w:szCs w:val="24"/>
         </w:rPr>
       </w:pPr>
-      <w:bookmarkStart w:id="37" w:name="_Toc231896212"/>
+      <w:bookmarkStart w:id="38" w:name="_Toc231896212"/>
       <w:r>
         <w:rPr>
           <w:i w:val="0"/>
@@ -34271,7 +36817,7 @@
         </w:rPr>
         <w:t>. Bắt lỗi khóa p không phải số nguyên tố(C#)</w:t>
       </w:r>
-      <w:bookmarkEnd w:id="37"/>
+      <w:bookmarkEnd w:id="38"/>
     </w:p>
     <w:p>
       <w:pPr>
@@ -34363,7 +36909,7 @@
           <w:szCs w:val="24"/>
         </w:rPr>
       </w:pPr>
-      <w:bookmarkStart w:id="38" w:name="_Toc231896213"/>
+      <w:bookmarkStart w:id="39" w:name="_Toc231896213"/>
       <w:r>
         <w:rPr>
           <w:i w:val="0"/>
@@ -34493,7 +37039,7 @@
         </w:rPr>
         <w:t>(C#)</w:t>
       </w:r>
-      <w:bookmarkEnd w:id="38"/>
+      <w:bookmarkEnd w:id="39"/>
     </w:p>
     <w:p>
       <w:pPr>
@@ -34562,7 +37108,7 @@
           <w:szCs w:val="24"/>
         </w:rPr>
       </w:pPr>
-      <w:bookmarkStart w:id="39" w:name="_Toc231896214"/>
+      <w:bookmarkStart w:id="40" w:name="_Toc231896214"/>
       <w:r>
         <w:rPr>
           <w:i w:val="0"/>
@@ -34682,7 +37228,7 @@
         </w:rPr>
         <w:t>. Bắt lỗi khóa để trống(C#)</w:t>
       </w:r>
-      <w:bookmarkEnd w:id="39"/>
+      <w:bookmarkEnd w:id="40"/>
     </w:p>
     <w:p>
       <w:pPr>
@@ -34781,7 +37327,7 @@
           <w:szCs w:val="24"/>
         </w:rPr>
       </w:pPr>
-      <w:bookmarkStart w:id="40" w:name="_Toc231896215"/>
+      <w:bookmarkStart w:id="41" w:name="_Toc231896215"/>
       <w:r>
         <w:rPr>
           <w:i w:val="0"/>
@@ -34901,7 +37447,7 @@
         </w:rPr>
         <w:t>. Để trống thông tin bên phần ký văn bản mà vẫn ấn lưu(C#)</w:t>
       </w:r>
-      <w:bookmarkEnd w:id="40"/>
+      <w:bookmarkEnd w:id="41"/>
     </w:p>
     <w:p>
       <w:pPr>
@@ -35009,7 +37555,7 @@
           <w:szCs w:val="24"/>
         </w:rPr>
       </w:pPr>
-      <w:bookmarkStart w:id="41" w:name="_Toc231896216"/>
+      <w:bookmarkStart w:id="42" w:name="_Toc231896216"/>
       <w:r>
         <w:rPr>
           <w:i w:val="0"/>
@@ -35129,7 +37675,7 @@
         </w:rPr>
         <w:t>. Bắt lỗi để trống khóa hoặc thông tin phần xác minh(C#)</w:t>
       </w:r>
-      <w:bookmarkEnd w:id="41"/>
+      <w:bookmarkEnd w:id="42"/>
     </w:p>
     <w:p>
       <w:pPr>
@@ -35219,7 +37765,7 @@
           <w:szCs w:val="24"/>
         </w:rPr>
       </w:pPr>
-      <w:bookmarkStart w:id="42" w:name="_Toc231896217"/>
+      <w:bookmarkStart w:id="43" w:name="_Toc231896217"/>
       <w:r>
         <w:rPr>
           <w:i w:val="0"/>
@@ -35339,7 +37885,7 @@
         </w:rPr>
         <w:t>. Văn bản bị thay đổi, chữ ký bị thay đổi(C#)</w:t>
       </w:r>
-      <w:bookmarkEnd w:id="42"/>
+      <w:bookmarkEnd w:id="43"/>
     </w:p>
     <w:p>
       <w:pPr>
@@ -35407,7 +37953,7 @@
           <w:szCs w:val="24"/>
         </w:rPr>
       </w:pPr>
-      <w:bookmarkStart w:id="43" w:name="_Toc231896218"/>
+      <w:bookmarkStart w:id="44" w:name="_Toc231896218"/>
       <w:r>
         <w:rPr>
           <w:i w:val="0"/>
@@ -35527,7 +38073,7 @@
         </w:rPr>
         <w:t>. Bắt lỗi văn bản bị thay đổi, chữ ký bị thay đổi</w:t>
       </w:r>
-      <w:bookmarkEnd w:id="43"/>
+      <w:bookmarkEnd w:id="44"/>
     </w:p>
     <w:p>
       <w:pPr>
@@ -38123,7 +40669,7 @@
           <w:lang w:val="en-US"/>
         </w:rPr>
       </w:pPr>
-      <w:bookmarkStart w:id="44" w:name="_Toc231896219"/>
+      <w:bookmarkStart w:id="45" w:name="_Toc231896219"/>
       <w:r>
         <w:rPr>
           <w:i w:val="0"/>
@@ -38243,7 +40789,7 @@
         </w:rPr>
         <w:t>. Giao diện Quản lý khóa(Java)</w:t>
       </w:r>
-      <w:bookmarkEnd w:id="44"/>
+      <w:bookmarkEnd w:id="45"/>
     </w:p>
     <w:p>
       <w:pPr>
@@ -38311,7 +40857,7 @@
           <w:szCs w:val="24"/>
         </w:rPr>
       </w:pPr>
-      <w:bookmarkStart w:id="45" w:name="_Toc231896220"/>
+      <w:bookmarkStart w:id="46" w:name="_Toc231896220"/>
       <w:r>
         <w:rPr>
           <w:i w:val="0"/>
@@ -38431,7 +40977,7 @@
         </w:rPr>
         <w:t>. Giao diện Ký số dữ liệu(Java)</w:t>
       </w:r>
-      <w:bookmarkEnd w:id="45"/>
+      <w:bookmarkEnd w:id="46"/>
     </w:p>
     <w:p>
       <w:pPr>
@@ -38498,7 +41044,7 @@
           <w:szCs w:val="24"/>
         </w:rPr>
       </w:pPr>
-      <w:bookmarkStart w:id="46" w:name="_Toc231896221"/>
+      <w:bookmarkStart w:id="47" w:name="_Toc231896221"/>
       <w:r>
         <w:rPr>
           <w:i w:val="0"/>
@@ -38618,7 +41164,7 @@
         </w:rPr>
         <w:t>. Giao diện xác thực dữ liệu(Java)</w:t>
       </w:r>
-      <w:bookmarkEnd w:id="46"/>
+      <w:bookmarkEnd w:id="47"/>
     </w:p>
     <w:p>
       <w:pPr>
@@ -38876,7 +41422,7 @@
           <w:lang w:val="en-US"/>
         </w:rPr>
       </w:pPr>
-      <w:bookmarkStart w:id="47" w:name="_Toc231896222"/>
+      <w:bookmarkStart w:id="48" w:name="_Toc231896222"/>
       <w:r>
         <w:rPr>
           <w:i w:val="0"/>
@@ -38996,7 +41542,7 @@
         </w:rPr>
         <w:t>. Khởi tạo cấu hình bộ khóa mật mã(Java)</w:t>
       </w:r>
-      <w:bookmarkEnd w:id="47"/>
+      <w:bookmarkEnd w:id="48"/>
     </w:p>
     <w:p>
       <w:pPr>
@@ -39450,7 +41996,7 @@
           <w:szCs w:val="24"/>
         </w:rPr>
       </w:pPr>
-      <w:bookmarkStart w:id="48" w:name="_Toc231896223"/>
+      <w:bookmarkStart w:id="49" w:name="_Toc231896223"/>
       <w:r>
         <w:rPr>
           <w:i w:val="0"/>
@@ -39570,7 +42116,7 @@
         </w:rPr>
         <w:t>. Thực hiện ký số tệp tin dữ liệu đầu vào(Java)</w:t>
       </w:r>
-      <w:bookmarkEnd w:id="48"/>
+      <w:bookmarkEnd w:id="49"/>
     </w:p>
     <w:p>
       <w:pPr>
@@ -39939,7 +42485,7 @@
           <w:szCs w:val="24"/>
         </w:rPr>
       </w:pPr>
-      <w:bookmarkStart w:id="49" w:name="_Toc231896224"/>
+      <w:bookmarkStart w:id="50" w:name="_Toc231896224"/>
       <w:r>
         <w:rPr>
           <w:i w:val="0"/>
@@ -40059,7 +42605,7 @@
         </w:rPr>
         <w:t>. Xác thực tính toàn vẹn(Java)</w:t>
       </w:r>
-      <w:bookmarkEnd w:id="49"/>
+      <w:bookmarkEnd w:id="50"/>
     </w:p>
     <w:p>
       <w:pPr>
@@ -40211,7 +42757,7 @@
           <w:szCs w:val="24"/>
         </w:rPr>
       </w:pPr>
-      <w:bookmarkStart w:id="50" w:name="_Toc231896225"/>
+      <w:bookmarkStart w:id="51" w:name="_Toc231896225"/>
       <w:r>
         <w:rPr>
           <w:i w:val="0"/>
@@ -40331,7 +42877,7 @@
         </w:rPr>
         <w:t>. Bắt lỗi giả mạo tham số chữ ký(Java)</w:t>
       </w:r>
-      <w:bookmarkEnd w:id="50"/>
+      <w:bookmarkEnd w:id="51"/>
     </w:p>
     <w:p>
       <w:pPr>
@@ -40455,7 +43001,7 @@
           <w:szCs w:val="24"/>
         </w:rPr>
       </w:pPr>
-      <w:bookmarkStart w:id="51" w:name="_Toc231896226"/>
+      <w:bookmarkStart w:id="52" w:name="_Toc231896226"/>
       <w:r>
         <w:rPr>
           <w:i w:val="0"/>
@@ -40575,7 +43121,7 @@
         </w:rPr>
         <w:t>. Bắt lỗi nội dung tệp tin bị thay đổi(Java)</w:t>
       </w:r>
-      <w:bookmarkEnd w:id="51"/>
+      <w:bookmarkEnd w:id="52"/>
     </w:p>
     <w:p>
       <w:pPr>
@@ -40674,7 +43220,7 @@
           <w:szCs w:val="24"/>
         </w:rPr>
       </w:pPr>
-      <w:bookmarkStart w:id="52" w:name="_Toc231896227"/>
+      <w:bookmarkStart w:id="53" w:name="_Toc231896227"/>
       <w:r>
         <w:rPr>
           <w:i w:val="0"/>
@@ -40794,7 +43340,7 @@
         </w:rPr>
         <w:t>. Bắt lỗi nội dung tệp tin và chữ ký đều bị thay đổi(Java)</w:t>
       </w:r>
-      <w:bookmarkEnd w:id="52"/>
+      <w:bookmarkEnd w:id="53"/>
     </w:p>
     <w:p>
       <w:pPr>
@@ -40817,12 +43363,12 @@
         <w:spacing w:before="0" w:after="0" w:line="312" w:lineRule="auto"/>
         <w:jc w:val="center"/>
       </w:pPr>
-      <w:bookmarkStart w:id="53" w:name="_Toc231896357"/>
+      <w:bookmarkStart w:id="54" w:name="_Toc231896357"/>
       <w:r>
         <w:lastRenderedPageBreak/>
         <w:t>KẾT LUẬN VÀ BÀI HỌC KINH NGHIỆM</w:t>
       </w:r>
-      <w:bookmarkEnd w:id="53"/>
+      <w:bookmarkEnd w:id="54"/>
     </w:p>
     <w:p>
       <w:pPr>
@@ -40830,11 +43376,11 @@
         <w:spacing w:before="0" w:after="0" w:line="312" w:lineRule="auto"/>
         <w:jc w:val="both"/>
       </w:pPr>
-      <w:bookmarkStart w:id="54" w:name="_Toc231896358"/>
+      <w:bookmarkStart w:id="55" w:name="_Toc231896358"/>
       <w:r>
         <w:t>3.1. Kiến thức kỹ năng đã học được trong quá trình thực hiện đề tài.</w:t>
       </w:r>
-      <w:bookmarkEnd w:id="54"/>
+      <w:bookmarkEnd w:id="55"/>
     </w:p>
     <w:p>
       <w:pPr>
@@ -41030,11 +43576,11 @@
         <w:spacing w:before="0" w:after="0" w:line="312" w:lineRule="auto"/>
         <w:jc w:val="both"/>
       </w:pPr>
-      <w:bookmarkStart w:id="55" w:name="_Toc231896359"/>
+      <w:bookmarkStart w:id="56" w:name="_Toc231896359"/>
       <w:r>
         <w:t>3.2. Bài học kinh nghiệm</w:t>
       </w:r>
-      <w:bookmarkEnd w:id="55"/>
+      <w:bookmarkEnd w:id="56"/>
     </w:p>
     <w:p>
       <w:pPr>
@@ -41310,21 +43856,21 @@
       <w:pPr>
         <w:pStyle w:val="Heading2"/>
       </w:pPr>
-      <w:bookmarkStart w:id="56" w:name="_Toc231896360"/>
+      <w:bookmarkStart w:id="57" w:name="_Toc231896360"/>
       <w:r>
         <w:t>3.3. Đánh giá tính khả thi, thuận lợi và khó khăn của chủ đề nghiên cứu</w:t>
       </w:r>
-      <w:bookmarkEnd w:id="56"/>
+      <w:bookmarkEnd w:id="57"/>
     </w:p>
     <w:p>
       <w:pPr>
         <w:pStyle w:val="Heading3"/>
       </w:pPr>
-      <w:bookmarkStart w:id="57" w:name="_Toc231896361"/>
+      <w:bookmarkStart w:id="58" w:name="_Toc231896361"/>
       <w:r>
         <w:t>3.3.1. Tính khả thi của chủ đề nghiên cứu</w:t>
       </w:r>
-      <w:bookmarkEnd w:id="57"/>
+      <w:bookmarkEnd w:id="58"/>
     </w:p>
     <w:p>
       <w:pPr>
@@ -41532,11 +44078,11 @@
       <w:pPr>
         <w:pStyle w:val="Heading3"/>
       </w:pPr>
-      <w:bookmarkStart w:id="58" w:name="_Toc231896362"/>
+      <w:bookmarkStart w:id="59" w:name="_Toc231896362"/>
       <w:r>
         <w:t>3.3.2. Những thuận lợi trong quá trình nghiên cứu</w:t>
       </w:r>
-      <w:bookmarkEnd w:id="58"/>
+      <w:bookmarkEnd w:id="59"/>
     </w:p>
     <w:p>
       <w:pPr>
@@ -42419,12 +44965,12 @@
         <w:spacing w:before="0" w:after="0" w:line="312" w:lineRule="auto"/>
         <w:jc w:val="center"/>
       </w:pPr>
-      <w:bookmarkStart w:id="59" w:name="_Toc231896363"/>
+      <w:bookmarkStart w:id="60" w:name="_Toc231896363"/>
       <w:r>
         <w:lastRenderedPageBreak/>
         <w:t>TÀI LIỆU THAM KHẢO</w:t>
       </w:r>
-      <w:bookmarkEnd w:id="59"/>
+      <w:bookmarkEnd w:id="60"/>
     </w:p>
     <w:p>
       <w:pPr>
@@ -42586,11 +45132,11 @@
           <w:numId w:val="0"/>
         </w:numPr>
       </w:pPr>
-      <w:bookmarkStart w:id="60" w:name="_Toc231896364"/>
+      <w:bookmarkStart w:id="61" w:name="_Toc231896364"/>
       <w:r>
         <w:t>PHỤ LỤC 1: CHƯƠNG TRÌNH JAVA</w:t>
       </w:r>
-      <w:bookmarkEnd w:id="60"/>
+      <w:bookmarkEnd w:id="61"/>
     </w:p>
     <w:p>
       <w:pPr>
@@ -42626,11 +45172,11 @@
           <w:numId w:val="0"/>
         </w:numPr>
       </w:pPr>
-      <w:bookmarkStart w:id="61" w:name="_Toc231896365"/>
+      <w:bookmarkStart w:id="62" w:name="_Toc231896365"/>
       <w:r>
         <w:t>PHỤ LỤC 2: CHƯƠNG TRÌNH C#</w:t>
       </w:r>
-      <w:bookmarkEnd w:id="61"/>
+      <w:bookmarkEnd w:id="62"/>
     </w:p>
     <w:p>
       <w:pPr>
@@ -42742,7 +45288,7 @@
       <w:rPr>
         <w:noProof/>
       </w:rPr>
-      <w:t>2</w:t>
+      <w:t>8</w:t>
     </w:r>
     <w:r>
       <w:rPr>
@@ -48072,7 +50618,7 @@
     <w:link w:val="HnhChar"/>
     <w:autoRedefine/>
     <w:qFormat/>
-    <w:rsid w:val="00630EF1"/>
+    <w:rsid w:val="00B32566"/>
     <w:pPr>
       <w:widowControl w:val="0"/>
       <w:pBdr>
@@ -48100,10 +50646,10 @@
     <w:name w:val="Hình Char"/>
     <w:basedOn w:val="Heading3Char"/>
     <w:link w:val="Hnh"/>
-    <w:rsid w:val="00630EF1"/>
+    <w:rsid w:val="00B32566"/>
     <w:rPr>
       <w:rFonts w:ascii="Times New Roman" w:eastAsiaTheme="majorEastAsia" w:hAnsi="Times New Roman" w:cs="Times New Roman"/>
-      <w:b/>
+      <w:b w:val="0"/>
       <w:i/>
       <w:sz w:val="24"/>
       <w:szCs w:val="28"/>
@@ -48914,7 +51460,7 @@
 </file>
 
 <file path=customXml/itemProps1.xml><?xml version="1.0" encoding="utf-8"?>
-<ds:datastoreItem xmlns:ds="http://schemas.openxmlformats.org/officeDocument/2006/customXml" ds:itemID="{42662B3A-8D5E-43FD-A81C-747F4CBE7A10}">
+<ds:datastoreItem xmlns:ds="http://schemas.openxmlformats.org/officeDocument/2006/customXml" ds:itemID="{C057ADBB-DE26-4D00-B56E-43DBA800FA92}">
   <ds:schemaRefs>
     <ds:schemaRef ds:uri="http://schemas.openxmlformats.org/officeDocument/2006/bibliography"/>
   </ds:schemaRefs>

</xml_diff>